<commit_message>
Add walls, barriers and reflections, and a built-in user guide (v1.1.0)
Walls are drawn on the plan with a type preset (blocking dB, absorption,
height for partial barriers). Measurement influence in IDW, RBF and the
residual correction goes around full-height walls (visibility-graph
shortest paths) instead of through them. In the source model, sound loses
each crossed wall's transmission loss, bends around free wall ends and over
partial barriers (Kurze-Anderson form of Maekawa at 500 Hz, capped at
20 dB, with lit-side fading), and reflects once off each wall via image
sources treated like real sources. noise_model.py gains the same model and
matches the app to ~1e-12 dB on the demo.

The in-app user guide (? Guide / H) replaces the short How-to-use notes,
the demo now has walls, doorways, panels and a screen, and the README and
installation guide are updated.

Co-Authored-By: Claude Opus 5.5 <noreply@anthropic.com>
</commit_message>
<xml_diff>
--- a/Noise Contour Mapper - Installation Guide.docx
+++ b/Noise Contour Mapper - Installation Guide.docx
@@ -43,7 +43,7 @@
           <w:sz w:val="20"/>
           <w:szCs w:val="20"/>
         </w:rPr>
-        <w:t xml:space="preserve">Version 1.0.0   ·   July 2026   ·   Internal pilot</w:t>
+        <w:t xml:space="preserve">Version 1.1.0   ·   October 2026   ·   Internal pilot</w:t>
       </w:r>
     </w:p>
     <w:p>
@@ -518,6 +518,41 @@
       </w:r>
     </w:p>
     <w:p>
+      <w:pPr>
+        <w:spacing w:before="0" w:after="160"/>
+      </w:pPr>
+      <w:r>
+        <w:rPr>
+          <w:b/>
+          <w:bCs/>
+        </w:rPr>
+        <w:t xml:space="preserve">Built-in user guide: </w:t>
+      </w:r>
+      <w:r>
+        <w:t xml:space="preserve">the app includes complete step-by-step instructions, written for first-time users. Click </w:t>
+      </w:r>
+      <w:r>
+        <w:rPr>
+          <w:b/>
+          <w:bCs/>
+        </w:rPr>
+        <w:t xml:space="preserve">? Guide</w:t>
+      </w:r>
+      <w:r>
+        <w:t xml:space="preserve"> above the map, or press </w:t>
+      </w:r>
+      <w:r>
+        <w:rPr>
+          <w:b/>
+          <w:bCs/>
+        </w:rPr>
+        <w:t xml:space="preserve">H</w:t>
+      </w:r>
+      <w:r>
+        <w:t xml:space="preserve">, at any time. The summary below covers the main steps.</w:t>
+      </w:r>
+    </w:p>
+    <w:p>
       <w:r>
         <w:t xml:space="preserve">The numbered sections down the left side of the window follow the assessment workflow from top to bottom:</w:t>
       </w:r>
@@ -602,10 +637,10 @@
           <w:b/>
           <w:bCs/>
         </w:rPr>
-        <w:t xml:space="preserve">Calculation and display</w:t>
-      </w:r>
-      <w:r>
-        <w:t xml:space="preserve"> — the noise map updates live. Choose inverse distance weighting (IDW), radial basis interpolation, or the source model (below); adjust the color bands (defaults: &lt;80, 80–85, 85–90, 90–95, &gt;95 dBA), opacity, and contour lines.</w:t>
+        <w:t xml:space="preserve">Walls and barriers (optional)</w:t>
+      </w:r>
+      <w:r>
+        <w:t xml:space="preserve"> — in sidebar section 2c, choose the Type for new walls, then click Draw wall in the toolbar (or press W). Click where the wall starts and at each corner along it; double-click or press Esc to finish. Leave a gap for every doorway or opening — sound and the influence of your readings pass through gaps, not through walls. Wall ends snap onto nearby walls (a pink circle appears) so corners close without gaps; hold Shift for a straight horizontal or vertical line. In Pan mode, click a wall to select it, drag its round end handles to move it, change its Blocks (dB), Absorbs (%) or Height values in section 2c, or press Delete to remove it. Section 4.4 explains how walls change the map.</w:t>
       </w:r>
     </w:p>
     <w:p>
@@ -621,30 +656,10 @@
           <w:b/>
           <w:bCs/>
         </w:rPr>
-        <w:t xml:space="preserve">Source model + residuals (optional)</w:t>
-      </w:r>
-      <w:r>
-        <w:t xml:space="preserve"> — instead of interpolating between measurements only, place known equipment as noise sources: click </w:t>
-      </w:r>
-      <w:r>
-        <w:rPr>
-          <w:b/>
-          <w:bCs/>
-        </w:rPr>
-        <w:t xml:space="preserve">Add source</w:t>
-      </w:r>
-      <w:r>
-        <w:t xml:space="preserve"> in the toolbar, click the machine's location, and enter its sound level at a reference distance (e.g., 92 dBA at 1 m from a nameplate or close-up reading). Then set the calculation method to </w:t>
-      </w:r>
-      <w:r>
-        <w:rPr>
-          <w:b/>
-          <w:bCs/>
-        </w:rPr>
-        <w:t xml:space="preserve">Source model + residuals</w:t>
-      </w:r>
-      <w:r>
-        <w:t xml:space="preserve">. The tool predicts levels physically (inverse square law, energies added logarithmically) and calibrates the prediction so it matches your SLM readings exactly at each measurement point. Requires a calibrated scale. Sources appear as orange diamonds and can be dragged; their levels are edited in sidebar section 2b. The result is a planning and visualization aid — not a replacement for personal dosimetry or regulatory exposure assessment.</w:t>
+        <w:t xml:space="preserve">Calculation and display</w:t>
+      </w:r>
+      <w:r>
+        <w:t xml:space="preserve"> — the noise map updates live. Choose inverse distance weighting (IDW), radial basis interpolation, or the source model (below); adjust the color bands (defaults: &lt;80, 80–85, 85–90, 90–95, &gt;95 dBA), opacity, and contour lines. Section 3 also holds the wall settings: Measurements don’t pass through walls, Walls block sound, Walls reflect sound, and the machine and ear heights used for partial barriers.</w:t>
       </w:r>
     </w:p>
     <w:p>
@@ -660,10 +675,49 @@
           <w:b/>
           <w:bCs/>
         </w:rPr>
+        <w:t xml:space="preserve">Source model + residuals (optional)</w:t>
+      </w:r>
+      <w:r>
+        <w:t xml:space="preserve"> — instead of interpolating between measurements only, place known equipment as noise sources: click </w:t>
+      </w:r>
+      <w:r>
+        <w:rPr>
+          <w:b/>
+          <w:bCs/>
+        </w:rPr>
+        <w:t xml:space="preserve">Add source</w:t>
+      </w:r>
+      <w:r>
+        <w:t xml:space="preserve"> in the toolbar, click the machine's location, and enter its sound level at a reference distance (e.g., 92 dBA at 1 m from a nameplate or close-up reading). Then set the calculation method to </w:t>
+      </w:r>
+      <w:r>
+        <w:rPr>
+          <w:b/>
+          <w:bCs/>
+        </w:rPr>
+        <w:t xml:space="preserve">Source model + residuals</w:t>
+      </w:r>
+      <w:r>
+        <w:t xml:space="preserve">. The tool predicts levels physically (inverse square law, energies added logarithmically) and calibrates the prediction so it matches your SLM readings exactly at each measurement point. Requires a calibrated scale. Sources appear as orange diamonds and can be dragged; their levels are edited in sidebar section 2b. The result is a planning and visualization aid — not a replacement for personal dosimetry or regulatory exposure assessment. With walls drawn, the prediction also includes blocking, sound bending around walls and over barriers, and reflections (Section 4.4).</w:t>
+      </w:r>
+    </w:p>
+    <w:p>
+      <w:pPr>
+        <w:pStyle w:val="ListParagraph"/>
+        <w:numPr>
+          <w:ilvl w:val="0"/>
+          <w:numId w:val="5"/>
+        </w:numPr>
+      </w:pPr>
+      <w:r>
+        <w:rPr>
+          <w:b/>
+          <w:bCs/>
+        </w:rPr>
         <w:t xml:space="preserve">Export</w:t>
       </w:r>
       <w:r>
-        <w:t xml:space="preserve"> — save the finished map as a PNG for reports, export the points as CSV (with both pixel and real-world coordinate columns when the scale is calibrated), or save the whole assessment as a project file (JSON) to continue later. Each export opens a standard Windows “Save As” dialog.</w:t>
+        <w:t xml:space="preserve"> — save the finished map as a PNG for reports, export the points as CSV (with both pixel and real-world coordinate columns when the scale is calibrated), or save the whole assessment as a project file (JSON) to continue later. Each export opens a standard Windows “Save As” dialog. The tool itself stores nothing, so save your project before you close it.</w:t>
       </w:r>
     </w:p>
     <w:p/>
@@ -674,9 +728,9 @@
       <w:r>
         <w:drawing>
           <wp:inline distT="0" distB="0" distL="0" distR="0">
-            <wp:extent cx="5905500" cy="3371850"/>
+            <wp:extent cx="5905500" cy="3796393"/>
             <wp:effectExtent t="0" r="0" b="0" l="0"/>
-            <wp:docPr id="1" name="app-screenshot" descr="Main window with demo noise map" title="Noise Contour Mapper"/>
+            <wp:docPr id="1" name="app-screenshot" descr="Demo facility noise map with walls" title="Noise Contour Mapper"/>
             <wp:cNvGraphicFramePr>
               <a:graphicFrameLocks xmlns:a="http://schemas.openxmlformats.org/drawingml/2006/main" noChangeAspect="1"/>
             </wp:cNvGraphicFramePr>
@@ -699,7 +753,7 @@
                   <pic:spPr bwMode="auto">
                     <a:xfrm>
                       <a:off x="0" y="0"/>
-                      <a:ext cx="5905500" cy="3371850"/>
+                      <a:ext cx="5905500" cy="3796393"/>
                     </a:xfrm>
                     <a:prstGeom prst="rect">
                       <a:avLst/>
@@ -725,7 +779,7 @@
           <w:sz w:val="18"/>
           <w:szCs w:val="18"/>
         </w:rPr>
-        <w:t xml:space="preserve">The demo facility using the source model: orange diamonds are noise sources (two presses and a compressor); circles are SLM measurement points; the green crosshair is the coordinate origin.</w:t>
+        <w:t xml:space="preserve">The demo facility using the source model with walls (exported map): dark lines are walls, with gaps for doorways; teal lines are walls lined with acoustic panels; the dashed brown line is a partial barrier. Orange diamonds are noise sources (two presses and a compressor); circles are SLM measurement points.</w:t>
       </w:r>
     </w:p>
     <w:tbl>
@@ -1499,7 +1553,12 @@
         <w:pStyle w:val="Heading2"/>
       </w:pPr>
       <w:r>
-        <w:t xml:space="preserve">4.4 Assumptions and limitations</w:t>
+        <w:t xml:space="preserve">4.4 Walls, barriers and reflections</w:t>
+      </w:r>
+    </w:p>
+    <w:p>
+      <w:r>
+        <w:t xml:space="preserve">Walls are drawn on the plan as straight segments (the Draw wall tool, sidebar section 2c). Each wall takes its starting values from a type preset, and every value can be changed for each wall:</w:t>
       </w:r>
     </w:p>
     <w:p>
@@ -1511,7 +1570,14 @@
         </w:numPr>
       </w:pPr>
       <w:r>
-        <w:t xml:space="preserve">Sources are idealized points in a free field. Large machines behave as line or area sources, and reverberant rooms decay more slowly than 6 dB per doubling — indoors the model is a baseline, not an exact solution.</w:t>
+        <w:rPr>
+          <w:b/>
+          <w:bCs/>
+        </w:rPr>
+        <w:t xml:space="preserve">Blocks (transmission loss, TL)</w:t>
+      </w:r>
+      <w:r>
+        <w:t xml:space="preserve"> — how many decibels sound loses passing through a full-height wall. The presets are effective field values, lower than laboratory ratings, because doors, gaps and flanking paths through floors and ceilings let sound past in real buildings.</w:t>
       </w:r>
     </w:p>
     <w:p>
@@ -1523,7 +1589,14 @@
         </w:numPr>
       </w:pPr>
       <w:r>
-        <w:t xml:space="preserve">Steady-state A-weighted levels are assumed; impulsive noise, tonal character, and duty-cycle variation are not modeled.</w:t>
+        <w:rPr>
+          <w:b/>
+          <w:bCs/>
+        </w:rPr>
+        <w:t xml:space="preserve">Absorbs (absorption coefficient α)</w:t>
+      </w:r>
+      <w:r>
+        <w:t xml:space="preserve"> — the share of sound energy the surface absorbs instead of reflecting. Hard surfaces absorb almost nothing, so they reflect almost everything.</w:t>
       </w:r>
     </w:p>
     <w:p>
@@ -1533,9 +1606,957 @@
           <w:ilvl w:val="0"/>
           <w:numId w:val="5"/>
         </w:numPr>
-      </w:pPr>
-      <w:r>
-        <w:t xml:space="preserve">Sound paths are not blocked by walls or barriers on the plan — attenuation is distance-only. Residual correction compensates only near the measurements that captured those effects.</w:t>
+        <w:spacing w:after="160"/>
+      </w:pPr>
+      <w:r>
+        <w:rPr>
+          <w:b/>
+          <w:bCs/>
+        </w:rPr>
+        <w:t xml:space="preserve">Height</w:t>
+      </w:r>
+      <w:r>
+        <w:t xml:space="preserve"> — partial barriers only (screens that do not reach the ceiling). Full-height walls have no height value.</w:t>
+      </w:r>
+    </w:p>
+    <w:tbl>
+      <w:tblPr>
+        <w:tblW w:type="dxa" w:w="9360"/>
+        <w:tblBorders>
+          <w:top w:val="single" w:color="auto" w:sz="4"/>
+          <w:left w:val="single" w:color="auto" w:sz="4"/>
+          <w:bottom w:val="single" w:color="auto" w:sz="4"/>
+          <w:right w:val="single" w:color="auto" w:sz="4"/>
+          <w:insideH w:val="single" w:color="auto" w:sz="4"/>
+          <w:insideV w:val="single" w:color="auto" w:sz="4"/>
+        </w:tblBorders>
+      </w:tblPr>
+      <w:tblGrid>
+        <w:gridCol w:w="3460"/>
+        <w:gridCol w:w="1700"/>
+        <w:gridCol w:w="1700"/>
+        <w:gridCol w:w="2500"/>
+      </w:tblGrid>
+      <w:tr>
+        <w:tc>
+          <w:tcPr>
+            <w:tcW w:type="dxa" w:w="3460"/>
+            <w:tcBorders>
+              <w:top w:val="single" w:color="BFC6CE" w:sz="1"/>
+              <w:left w:val="single" w:color="BFC6CE" w:sz="1"/>
+              <w:bottom w:val="single" w:color="BFC6CE" w:sz="1"/>
+              <w:right w:val="single" w:color="BFC6CE" w:sz="1"/>
+            </w:tcBorders>
+            <w:shd w:fill="1A355E" w:val="clear"/>
+            <w:tcMar>
+              <w:top w:type="dxa" w:w="80"/>
+              <w:left w:type="dxa" w:w="120"/>
+              <w:bottom w:type="dxa" w:w="80"/>
+              <w:right w:type="dxa" w:w="120"/>
+            </w:tcMar>
+          </w:tcPr>
+          <w:p>
+            <w:r>
+              <w:rPr>
+                <w:b/>
+                <w:bCs/>
+                <w:color w:val="FFFFFF"/>
+              </w:rPr>
+              <w:t xml:space="preserve">Wall type</w:t>
+            </w:r>
+          </w:p>
+        </w:tc>
+        <w:tc>
+          <w:tcPr>
+            <w:tcW w:type="dxa" w:w="1700"/>
+            <w:tcBorders>
+              <w:top w:val="single" w:color="BFC6CE" w:sz="1"/>
+              <w:left w:val="single" w:color="BFC6CE" w:sz="1"/>
+              <w:bottom w:val="single" w:color="BFC6CE" w:sz="1"/>
+              <w:right w:val="single" w:color="BFC6CE" w:sz="1"/>
+            </w:tcBorders>
+            <w:shd w:fill="1A355E" w:val="clear"/>
+            <w:tcMar>
+              <w:top w:type="dxa" w:w="80"/>
+              <w:left w:type="dxa" w:w="120"/>
+              <w:bottom w:type="dxa" w:w="80"/>
+              <w:right w:type="dxa" w:w="120"/>
+            </w:tcMar>
+          </w:tcPr>
+          <w:p>
+            <w:r>
+              <w:rPr>
+                <w:b/>
+                <w:bCs/>
+                <w:color w:val="FFFFFF"/>
+              </w:rPr>
+              <w:t xml:space="preserve">Blocks (TL)</w:t>
+            </w:r>
+          </w:p>
+        </w:tc>
+        <w:tc>
+          <w:tcPr>
+            <w:tcW w:type="dxa" w:w="1700"/>
+            <w:tcBorders>
+              <w:top w:val="single" w:color="BFC6CE" w:sz="1"/>
+              <w:left w:val="single" w:color="BFC6CE" w:sz="1"/>
+              <w:bottom w:val="single" w:color="BFC6CE" w:sz="1"/>
+              <w:right w:val="single" w:color="BFC6CE" w:sz="1"/>
+            </w:tcBorders>
+            <w:shd w:fill="1A355E" w:val="clear"/>
+            <w:tcMar>
+              <w:top w:type="dxa" w:w="80"/>
+              <w:left w:type="dxa" w:w="120"/>
+              <w:bottom w:type="dxa" w:w="80"/>
+              <w:right w:type="dxa" w:w="120"/>
+            </w:tcMar>
+          </w:tcPr>
+          <w:p>
+            <w:r>
+              <w:rPr>
+                <w:b/>
+                <w:bCs/>
+                <w:color w:val="FFFFFF"/>
+              </w:rPr>
+              <w:t xml:space="preserve">Absorbs (α)</w:t>
+            </w:r>
+          </w:p>
+        </w:tc>
+        <w:tc>
+          <w:tcPr>
+            <w:tcW w:type="dxa" w:w="2500"/>
+            <w:tcBorders>
+              <w:top w:val="single" w:color="BFC6CE" w:sz="1"/>
+              <w:left w:val="single" w:color="BFC6CE" w:sz="1"/>
+              <w:bottom w:val="single" w:color="BFC6CE" w:sz="1"/>
+              <w:right w:val="single" w:color="BFC6CE" w:sz="1"/>
+            </w:tcBorders>
+            <w:shd w:fill="1A355E" w:val="clear"/>
+            <w:tcMar>
+              <w:top w:type="dxa" w:w="80"/>
+              <w:left w:type="dxa" w:w="120"/>
+              <w:bottom w:type="dxa" w:w="80"/>
+              <w:right w:type="dxa" w:w="120"/>
+            </w:tcMar>
+          </w:tcPr>
+          <w:p>
+            <w:r>
+              <w:rPr>
+                <w:b/>
+                <w:bCs/>
+                <w:color w:val="FFFFFF"/>
+              </w:rPr>
+              <w:t xml:space="preserve">Height</w:t>
+            </w:r>
+          </w:p>
+        </w:tc>
+      </w:tr>
+      <w:tr>
+        <w:tc>
+          <w:tcPr>
+            <w:tcW w:type="dxa" w:w="3460"/>
+            <w:tcBorders>
+              <w:top w:val="single" w:color="BFC6CE" w:sz="1"/>
+              <w:left w:val="single" w:color="BFC6CE" w:sz="1"/>
+              <w:bottom w:val="single" w:color="BFC6CE" w:sz="1"/>
+              <w:right w:val="single" w:color="BFC6CE" w:sz="1"/>
+            </w:tcBorders>
+            <w:shd w:fill="EDF1F6" w:val="clear"/>
+            <w:tcMar>
+              <w:top w:type="dxa" w:w="80"/>
+              <w:left w:type="dxa" w:w="120"/>
+              <w:bottom w:type="dxa" w:w="80"/>
+              <w:right w:type="dxa" w:w="120"/>
+            </w:tcMar>
+          </w:tcPr>
+          <w:p>
+            <w:r>
+              <w:rPr>
+                <w:b/>
+                <w:bCs/>
+                <w:color w:val="000000"/>
+              </w:rPr>
+              <w:t xml:space="preserve">Concrete / masonry block</w:t>
+            </w:r>
+          </w:p>
+        </w:tc>
+        <w:tc>
+          <w:tcPr>
+            <w:tcW w:type="dxa" w:w="1700"/>
+            <w:tcBorders>
+              <w:top w:val="single" w:color="BFC6CE" w:sz="1"/>
+              <w:left w:val="single" w:color="BFC6CE" w:sz="1"/>
+              <w:bottom w:val="single" w:color="BFC6CE" w:sz="1"/>
+              <w:right w:val="single" w:color="BFC6CE" w:sz="1"/>
+            </w:tcBorders>
+            <w:tcMar>
+              <w:top w:type="dxa" w:w="80"/>
+              <w:left w:type="dxa" w:w="120"/>
+              <w:bottom w:type="dxa" w:w="80"/>
+              <w:right w:type="dxa" w:w="120"/>
+            </w:tcMar>
+          </w:tcPr>
+          <w:p>
+            <w:r>
+              <w:rPr>
+                <w:b w:val="false"/>
+                <w:bCs w:val="false"/>
+                <w:color w:val="000000"/>
+              </w:rPr>
+              <w:t xml:space="preserve">30 dB</w:t>
+            </w:r>
+          </w:p>
+        </w:tc>
+        <w:tc>
+          <w:tcPr>
+            <w:tcW w:type="dxa" w:w="1700"/>
+            <w:tcBorders>
+              <w:top w:val="single" w:color="BFC6CE" w:sz="1"/>
+              <w:left w:val="single" w:color="BFC6CE" w:sz="1"/>
+              <w:bottom w:val="single" w:color="BFC6CE" w:sz="1"/>
+              <w:right w:val="single" w:color="BFC6CE" w:sz="1"/>
+            </w:tcBorders>
+            <w:tcMar>
+              <w:top w:type="dxa" w:w="80"/>
+              <w:left w:type="dxa" w:w="120"/>
+              <w:bottom w:type="dxa" w:w="80"/>
+              <w:right w:type="dxa" w:w="120"/>
+            </w:tcMar>
+          </w:tcPr>
+          <w:p>
+            <w:r>
+              <w:rPr>
+                <w:b w:val="false"/>
+                <w:bCs w:val="false"/>
+                <w:color w:val="000000"/>
+              </w:rPr>
+              <w:t xml:space="preserve">2%</w:t>
+            </w:r>
+          </w:p>
+        </w:tc>
+        <w:tc>
+          <w:tcPr>
+            <w:tcW w:type="dxa" w:w="2500"/>
+            <w:tcBorders>
+              <w:top w:val="single" w:color="BFC6CE" w:sz="1"/>
+              <w:left w:val="single" w:color="BFC6CE" w:sz="1"/>
+              <w:bottom w:val="single" w:color="BFC6CE" w:sz="1"/>
+              <w:right w:val="single" w:color="BFC6CE" w:sz="1"/>
+            </w:tcBorders>
+            <w:tcMar>
+              <w:top w:type="dxa" w:w="80"/>
+              <w:left w:type="dxa" w:w="120"/>
+              <w:bottom w:type="dxa" w:w="80"/>
+              <w:right w:type="dxa" w:w="120"/>
+            </w:tcMar>
+          </w:tcPr>
+          <w:p>
+            <w:r>
+              <w:rPr>
+                <w:b w:val="false"/>
+                <w:bCs w:val="false"/>
+                <w:color w:val="000000"/>
+              </w:rPr>
+              <w:t xml:space="preserve">Full</w:t>
+            </w:r>
+          </w:p>
+        </w:tc>
+      </w:tr>
+      <w:tr>
+        <w:tc>
+          <w:tcPr>
+            <w:tcW w:type="dxa" w:w="3460"/>
+            <w:tcBorders>
+              <w:top w:val="single" w:color="BFC6CE" w:sz="1"/>
+              <w:left w:val="single" w:color="BFC6CE" w:sz="1"/>
+              <w:bottom w:val="single" w:color="BFC6CE" w:sz="1"/>
+              <w:right w:val="single" w:color="BFC6CE" w:sz="1"/>
+            </w:tcBorders>
+            <w:shd w:fill="EDF1F6" w:val="clear"/>
+            <w:tcMar>
+              <w:top w:type="dxa" w:w="80"/>
+              <w:left w:type="dxa" w:w="120"/>
+              <w:bottom w:type="dxa" w:w="80"/>
+              <w:right w:type="dxa" w:w="120"/>
+            </w:tcMar>
+          </w:tcPr>
+          <w:p>
+            <w:r>
+              <w:rPr>
+                <w:b/>
+                <w:bCs/>
+                <w:color w:val="000000"/>
+              </w:rPr>
+              <w:t xml:space="preserve">Concrete with acoustic panels</w:t>
+            </w:r>
+          </w:p>
+        </w:tc>
+        <w:tc>
+          <w:tcPr>
+            <w:tcW w:type="dxa" w:w="1700"/>
+            <w:tcBorders>
+              <w:top w:val="single" w:color="BFC6CE" w:sz="1"/>
+              <w:left w:val="single" w:color="BFC6CE" w:sz="1"/>
+              <w:bottom w:val="single" w:color="BFC6CE" w:sz="1"/>
+              <w:right w:val="single" w:color="BFC6CE" w:sz="1"/>
+            </w:tcBorders>
+            <w:tcMar>
+              <w:top w:type="dxa" w:w="80"/>
+              <w:left w:type="dxa" w:w="120"/>
+              <w:bottom w:type="dxa" w:w="80"/>
+              <w:right w:type="dxa" w:w="120"/>
+            </w:tcMar>
+          </w:tcPr>
+          <w:p>
+            <w:r>
+              <w:rPr>
+                <w:b w:val="false"/>
+                <w:bCs w:val="false"/>
+                <w:color w:val="000000"/>
+              </w:rPr>
+              <w:t xml:space="preserve">30 dB</w:t>
+            </w:r>
+          </w:p>
+        </w:tc>
+        <w:tc>
+          <w:tcPr>
+            <w:tcW w:type="dxa" w:w="1700"/>
+            <w:tcBorders>
+              <w:top w:val="single" w:color="BFC6CE" w:sz="1"/>
+              <w:left w:val="single" w:color="BFC6CE" w:sz="1"/>
+              <w:bottom w:val="single" w:color="BFC6CE" w:sz="1"/>
+              <w:right w:val="single" w:color="BFC6CE" w:sz="1"/>
+            </w:tcBorders>
+            <w:tcMar>
+              <w:top w:type="dxa" w:w="80"/>
+              <w:left w:type="dxa" w:w="120"/>
+              <w:bottom w:type="dxa" w:w="80"/>
+              <w:right w:type="dxa" w:w="120"/>
+            </w:tcMar>
+          </w:tcPr>
+          <w:p>
+            <w:r>
+              <w:rPr>
+                <w:b w:val="false"/>
+                <w:bCs w:val="false"/>
+                <w:color w:val="000000"/>
+              </w:rPr>
+              <w:t xml:space="preserve">70%</w:t>
+            </w:r>
+          </w:p>
+        </w:tc>
+        <w:tc>
+          <w:tcPr>
+            <w:tcW w:type="dxa" w:w="2500"/>
+            <w:tcBorders>
+              <w:top w:val="single" w:color="BFC6CE" w:sz="1"/>
+              <w:left w:val="single" w:color="BFC6CE" w:sz="1"/>
+              <w:bottom w:val="single" w:color="BFC6CE" w:sz="1"/>
+              <w:right w:val="single" w:color="BFC6CE" w:sz="1"/>
+            </w:tcBorders>
+            <w:tcMar>
+              <w:top w:type="dxa" w:w="80"/>
+              <w:left w:type="dxa" w:w="120"/>
+              <w:bottom w:type="dxa" w:w="80"/>
+              <w:right w:type="dxa" w:w="120"/>
+            </w:tcMar>
+          </w:tcPr>
+          <w:p>
+            <w:r>
+              <w:rPr>
+                <w:b w:val="false"/>
+                <w:bCs w:val="false"/>
+                <w:color w:val="000000"/>
+              </w:rPr>
+              <w:t xml:space="preserve">Full</w:t>
+            </w:r>
+          </w:p>
+        </w:tc>
+      </w:tr>
+      <w:tr>
+        <w:tc>
+          <w:tcPr>
+            <w:tcW w:type="dxa" w:w="3460"/>
+            <w:tcBorders>
+              <w:top w:val="single" w:color="BFC6CE" w:sz="1"/>
+              <w:left w:val="single" w:color="BFC6CE" w:sz="1"/>
+              <w:bottom w:val="single" w:color="BFC6CE" w:sz="1"/>
+              <w:right w:val="single" w:color="BFC6CE" w:sz="1"/>
+            </w:tcBorders>
+            <w:shd w:fill="EDF1F6" w:val="clear"/>
+            <w:tcMar>
+              <w:top w:type="dxa" w:w="80"/>
+              <w:left w:type="dxa" w:w="120"/>
+              <w:bottom w:type="dxa" w:w="80"/>
+              <w:right w:type="dxa" w:w="120"/>
+            </w:tcMar>
+          </w:tcPr>
+          <w:p>
+            <w:r>
+              <w:rPr>
+                <w:b/>
+                <w:bCs/>
+                <w:color w:val="000000"/>
+              </w:rPr>
+              <w:t xml:space="preserve">Drywall / stud partition</w:t>
+            </w:r>
+          </w:p>
+        </w:tc>
+        <w:tc>
+          <w:tcPr>
+            <w:tcW w:type="dxa" w:w="1700"/>
+            <w:tcBorders>
+              <w:top w:val="single" w:color="BFC6CE" w:sz="1"/>
+              <w:left w:val="single" w:color="BFC6CE" w:sz="1"/>
+              <w:bottom w:val="single" w:color="BFC6CE" w:sz="1"/>
+              <w:right w:val="single" w:color="BFC6CE" w:sz="1"/>
+            </w:tcBorders>
+            <w:tcMar>
+              <w:top w:type="dxa" w:w="80"/>
+              <w:left w:type="dxa" w:w="120"/>
+              <w:bottom w:type="dxa" w:w="80"/>
+              <w:right w:type="dxa" w:w="120"/>
+            </w:tcMar>
+          </w:tcPr>
+          <w:p>
+            <w:r>
+              <w:rPr>
+                <w:b w:val="false"/>
+                <w:bCs w:val="false"/>
+                <w:color w:val="000000"/>
+              </w:rPr>
+              <w:t xml:space="preserve">20 dB</w:t>
+            </w:r>
+          </w:p>
+        </w:tc>
+        <w:tc>
+          <w:tcPr>
+            <w:tcW w:type="dxa" w:w="1700"/>
+            <w:tcBorders>
+              <w:top w:val="single" w:color="BFC6CE" w:sz="1"/>
+              <w:left w:val="single" w:color="BFC6CE" w:sz="1"/>
+              <w:bottom w:val="single" w:color="BFC6CE" w:sz="1"/>
+              <w:right w:val="single" w:color="BFC6CE" w:sz="1"/>
+            </w:tcBorders>
+            <w:tcMar>
+              <w:top w:type="dxa" w:w="80"/>
+              <w:left w:type="dxa" w:w="120"/>
+              <w:bottom w:type="dxa" w:w="80"/>
+              <w:right w:type="dxa" w:w="120"/>
+            </w:tcMar>
+          </w:tcPr>
+          <w:p>
+            <w:r>
+              <w:rPr>
+                <w:b w:val="false"/>
+                <w:bCs w:val="false"/>
+                <w:color w:val="000000"/>
+              </w:rPr>
+              <w:t xml:space="preserve">5%</w:t>
+            </w:r>
+          </w:p>
+        </w:tc>
+        <w:tc>
+          <w:tcPr>
+            <w:tcW w:type="dxa" w:w="2500"/>
+            <w:tcBorders>
+              <w:top w:val="single" w:color="BFC6CE" w:sz="1"/>
+              <w:left w:val="single" w:color="BFC6CE" w:sz="1"/>
+              <w:bottom w:val="single" w:color="BFC6CE" w:sz="1"/>
+              <w:right w:val="single" w:color="BFC6CE" w:sz="1"/>
+            </w:tcBorders>
+            <w:tcMar>
+              <w:top w:type="dxa" w:w="80"/>
+              <w:left w:type="dxa" w:w="120"/>
+              <w:bottom w:type="dxa" w:w="80"/>
+              <w:right w:type="dxa" w:w="120"/>
+            </w:tcMar>
+          </w:tcPr>
+          <w:p>
+            <w:r>
+              <w:rPr>
+                <w:b w:val="false"/>
+                <w:bCs w:val="false"/>
+                <w:color w:val="000000"/>
+              </w:rPr>
+              <w:t xml:space="preserve">Full</w:t>
+            </w:r>
+          </w:p>
+        </w:tc>
+      </w:tr>
+      <w:tr>
+        <w:tc>
+          <w:tcPr>
+            <w:tcW w:type="dxa" w:w="3460"/>
+            <w:tcBorders>
+              <w:top w:val="single" w:color="BFC6CE" w:sz="1"/>
+              <w:left w:val="single" w:color="BFC6CE" w:sz="1"/>
+              <w:bottom w:val="single" w:color="BFC6CE" w:sz="1"/>
+              <w:right w:val="single" w:color="BFC6CE" w:sz="1"/>
+            </w:tcBorders>
+            <w:shd w:fill="EDF1F6" w:val="clear"/>
+            <w:tcMar>
+              <w:top w:type="dxa" w:w="80"/>
+              <w:left w:type="dxa" w:w="120"/>
+              <w:bottom w:type="dxa" w:w="80"/>
+              <w:right w:type="dxa" w:w="120"/>
+            </w:tcMar>
+          </w:tcPr>
+          <w:p>
+            <w:r>
+              <w:rPr>
+                <w:b/>
+                <w:bCs/>
+                <w:color w:val="000000"/>
+              </w:rPr>
+              <w:t xml:space="preserve">Metal panel / sheet steel</w:t>
+            </w:r>
+          </w:p>
+        </w:tc>
+        <w:tc>
+          <w:tcPr>
+            <w:tcW w:type="dxa" w:w="1700"/>
+            <w:tcBorders>
+              <w:top w:val="single" w:color="BFC6CE" w:sz="1"/>
+              <w:left w:val="single" w:color="BFC6CE" w:sz="1"/>
+              <w:bottom w:val="single" w:color="BFC6CE" w:sz="1"/>
+              <w:right w:val="single" w:color="BFC6CE" w:sz="1"/>
+            </w:tcBorders>
+            <w:tcMar>
+              <w:top w:type="dxa" w:w="80"/>
+              <w:left w:type="dxa" w:w="120"/>
+              <w:bottom w:type="dxa" w:w="80"/>
+              <w:right w:type="dxa" w:w="120"/>
+            </w:tcMar>
+          </w:tcPr>
+          <w:p>
+            <w:r>
+              <w:rPr>
+                <w:b w:val="false"/>
+                <w:bCs w:val="false"/>
+                <w:color w:val="000000"/>
+              </w:rPr>
+              <w:t xml:space="preserve">20 dB</w:t>
+            </w:r>
+          </w:p>
+        </w:tc>
+        <w:tc>
+          <w:tcPr>
+            <w:tcW w:type="dxa" w:w="1700"/>
+            <w:tcBorders>
+              <w:top w:val="single" w:color="BFC6CE" w:sz="1"/>
+              <w:left w:val="single" w:color="BFC6CE" w:sz="1"/>
+              <w:bottom w:val="single" w:color="BFC6CE" w:sz="1"/>
+              <w:right w:val="single" w:color="BFC6CE" w:sz="1"/>
+            </w:tcBorders>
+            <w:tcMar>
+              <w:top w:type="dxa" w:w="80"/>
+              <w:left w:type="dxa" w:w="120"/>
+              <w:bottom w:type="dxa" w:w="80"/>
+              <w:right w:type="dxa" w:w="120"/>
+            </w:tcMar>
+          </w:tcPr>
+          <w:p>
+            <w:r>
+              <w:rPr>
+                <w:b w:val="false"/>
+                <w:bCs w:val="false"/>
+                <w:color w:val="000000"/>
+              </w:rPr>
+              <w:t xml:space="preserve">5%</w:t>
+            </w:r>
+          </w:p>
+        </w:tc>
+        <w:tc>
+          <w:tcPr>
+            <w:tcW w:type="dxa" w:w="2500"/>
+            <w:tcBorders>
+              <w:top w:val="single" w:color="BFC6CE" w:sz="1"/>
+              <w:left w:val="single" w:color="BFC6CE" w:sz="1"/>
+              <w:bottom w:val="single" w:color="BFC6CE" w:sz="1"/>
+              <w:right w:val="single" w:color="BFC6CE" w:sz="1"/>
+            </w:tcBorders>
+            <w:tcMar>
+              <w:top w:type="dxa" w:w="80"/>
+              <w:left w:type="dxa" w:w="120"/>
+              <w:bottom w:type="dxa" w:w="80"/>
+              <w:right w:type="dxa" w:w="120"/>
+            </w:tcMar>
+          </w:tcPr>
+          <w:p>
+            <w:r>
+              <w:rPr>
+                <w:b w:val="false"/>
+                <w:bCs w:val="false"/>
+                <w:color w:val="000000"/>
+              </w:rPr>
+              <w:t xml:space="preserve">Full</w:t>
+            </w:r>
+          </w:p>
+        </w:tc>
+      </w:tr>
+      <w:tr>
+        <w:tc>
+          <w:tcPr>
+            <w:tcW w:type="dxa" w:w="3460"/>
+            <w:tcBorders>
+              <w:top w:val="single" w:color="BFC6CE" w:sz="1"/>
+              <w:left w:val="single" w:color="BFC6CE" w:sz="1"/>
+              <w:bottom w:val="single" w:color="BFC6CE" w:sz="1"/>
+              <w:right w:val="single" w:color="BFC6CE" w:sz="1"/>
+            </w:tcBorders>
+            <w:shd w:fill="EDF1F6" w:val="clear"/>
+            <w:tcMar>
+              <w:top w:type="dxa" w:w="80"/>
+              <w:left w:type="dxa" w:w="120"/>
+              <w:bottom w:type="dxa" w:w="80"/>
+              <w:right w:type="dxa" w:w="120"/>
+            </w:tcMar>
+          </w:tcPr>
+          <w:p>
+            <w:r>
+              <w:rPr>
+                <w:b/>
+                <w:bCs/>
+                <w:color w:val="000000"/>
+              </w:rPr>
+              <w:t xml:space="preserve">Glass / window wall</w:t>
+            </w:r>
+          </w:p>
+        </w:tc>
+        <w:tc>
+          <w:tcPr>
+            <w:tcW w:type="dxa" w:w="1700"/>
+            <w:tcBorders>
+              <w:top w:val="single" w:color="BFC6CE" w:sz="1"/>
+              <w:left w:val="single" w:color="BFC6CE" w:sz="1"/>
+              <w:bottom w:val="single" w:color="BFC6CE" w:sz="1"/>
+              <w:right w:val="single" w:color="BFC6CE" w:sz="1"/>
+            </w:tcBorders>
+            <w:tcMar>
+              <w:top w:type="dxa" w:w="80"/>
+              <w:left w:type="dxa" w:w="120"/>
+              <w:bottom w:type="dxa" w:w="80"/>
+              <w:right w:type="dxa" w:w="120"/>
+            </w:tcMar>
+          </w:tcPr>
+          <w:p>
+            <w:r>
+              <w:rPr>
+                <w:b w:val="false"/>
+                <w:bCs w:val="false"/>
+                <w:color w:val="000000"/>
+              </w:rPr>
+              <w:t xml:space="preserve">20 dB</w:t>
+            </w:r>
+          </w:p>
+        </w:tc>
+        <w:tc>
+          <w:tcPr>
+            <w:tcW w:type="dxa" w:w="1700"/>
+            <w:tcBorders>
+              <w:top w:val="single" w:color="BFC6CE" w:sz="1"/>
+              <w:left w:val="single" w:color="BFC6CE" w:sz="1"/>
+              <w:bottom w:val="single" w:color="BFC6CE" w:sz="1"/>
+              <w:right w:val="single" w:color="BFC6CE" w:sz="1"/>
+            </w:tcBorders>
+            <w:tcMar>
+              <w:top w:type="dxa" w:w="80"/>
+              <w:left w:type="dxa" w:w="120"/>
+              <w:bottom w:type="dxa" w:w="80"/>
+              <w:right w:type="dxa" w:w="120"/>
+            </w:tcMar>
+          </w:tcPr>
+          <w:p>
+            <w:r>
+              <w:rPr>
+                <w:b w:val="false"/>
+                <w:bCs w:val="false"/>
+                <w:color w:val="000000"/>
+              </w:rPr>
+              <w:t xml:space="preserve">4%</w:t>
+            </w:r>
+          </w:p>
+        </w:tc>
+        <w:tc>
+          <w:tcPr>
+            <w:tcW w:type="dxa" w:w="2500"/>
+            <w:tcBorders>
+              <w:top w:val="single" w:color="BFC6CE" w:sz="1"/>
+              <w:left w:val="single" w:color="BFC6CE" w:sz="1"/>
+              <w:bottom w:val="single" w:color="BFC6CE" w:sz="1"/>
+              <w:right w:val="single" w:color="BFC6CE" w:sz="1"/>
+            </w:tcBorders>
+            <w:tcMar>
+              <w:top w:type="dxa" w:w="80"/>
+              <w:left w:type="dxa" w:w="120"/>
+              <w:bottom w:type="dxa" w:w="80"/>
+              <w:right w:type="dxa" w:w="120"/>
+            </w:tcMar>
+          </w:tcPr>
+          <w:p>
+            <w:r>
+              <w:rPr>
+                <w:b w:val="false"/>
+                <w:bCs w:val="false"/>
+                <w:color w:val="000000"/>
+              </w:rPr>
+              <w:t xml:space="preserve">Full</w:t>
+            </w:r>
+          </w:p>
+        </w:tc>
+      </w:tr>
+      <w:tr>
+        <w:tc>
+          <w:tcPr>
+            <w:tcW w:type="dxa" w:w="3460"/>
+            <w:tcBorders>
+              <w:top w:val="single" w:color="BFC6CE" w:sz="1"/>
+              <w:left w:val="single" w:color="BFC6CE" w:sz="1"/>
+              <w:bottom w:val="single" w:color="BFC6CE" w:sz="1"/>
+              <w:right w:val="single" w:color="BFC6CE" w:sz="1"/>
+            </w:tcBorders>
+            <w:shd w:fill="EDF1F6" w:val="clear"/>
+            <w:tcMar>
+              <w:top w:type="dxa" w:w="80"/>
+              <w:left w:type="dxa" w:w="120"/>
+              <w:bottom w:type="dxa" w:w="80"/>
+              <w:right w:type="dxa" w:w="120"/>
+            </w:tcMar>
+          </w:tcPr>
+          <w:p>
+            <w:r>
+              <w:rPr>
+                <w:b/>
+                <w:bCs/>
+                <w:color w:val="000000"/>
+              </w:rPr>
+              <w:t xml:space="preserve">Acoustic curtain</w:t>
+            </w:r>
+          </w:p>
+        </w:tc>
+        <w:tc>
+          <w:tcPr>
+            <w:tcW w:type="dxa" w:w="1700"/>
+            <w:tcBorders>
+              <w:top w:val="single" w:color="BFC6CE" w:sz="1"/>
+              <w:left w:val="single" w:color="BFC6CE" w:sz="1"/>
+              <w:bottom w:val="single" w:color="BFC6CE" w:sz="1"/>
+              <w:right w:val="single" w:color="BFC6CE" w:sz="1"/>
+            </w:tcBorders>
+            <w:tcMar>
+              <w:top w:type="dxa" w:w="80"/>
+              <w:left w:type="dxa" w:w="120"/>
+              <w:bottom w:type="dxa" w:w="80"/>
+              <w:right w:type="dxa" w:w="120"/>
+            </w:tcMar>
+          </w:tcPr>
+          <w:p>
+            <w:r>
+              <w:rPr>
+                <w:b w:val="false"/>
+                <w:bCs w:val="false"/>
+                <w:color w:val="000000"/>
+              </w:rPr>
+              <w:t xml:space="preserve">10 dB</w:t>
+            </w:r>
+          </w:p>
+        </w:tc>
+        <w:tc>
+          <w:tcPr>
+            <w:tcW w:type="dxa" w:w="1700"/>
+            <w:tcBorders>
+              <w:top w:val="single" w:color="BFC6CE" w:sz="1"/>
+              <w:left w:val="single" w:color="BFC6CE" w:sz="1"/>
+              <w:bottom w:val="single" w:color="BFC6CE" w:sz="1"/>
+              <w:right w:val="single" w:color="BFC6CE" w:sz="1"/>
+            </w:tcBorders>
+            <w:tcMar>
+              <w:top w:type="dxa" w:w="80"/>
+              <w:left w:type="dxa" w:w="120"/>
+              <w:bottom w:type="dxa" w:w="80"/>
+              <w:right w:type="dxa" w:w="120"/>
+            </w:tcMar>
+          </w:tcPr>
+          <w:p>
+            <w:r>
+              <w:rPr>
+                <w:b w:val="false"/>
+                <w:bCs w:val="false"/>
+                <w:color w:val="000000"/>
+              </w:rPr>
+              <w:t xml:space="preserve">50%</w:t>
+            </w:r>
+          </w:p>
+        </w:tc>
+        <w:tc>
+          <w:tcPr>
+            <w:tcW w:type="dxa" w:w="2500"/>
+            <w:tcBorders>
+              <w:top w:val="single" w:color="BFC6CE" w:sz="1"/>
+              <w:left w:val="single" w:color="BFC6CE" w:sz="1"/>
+              <w:bottom w:val="single" w:color="BFC6CE" w:sz="1"/>
+              <w:right w:val="single" w:color="BFC6CE" w:sz="1"/>
+            </w:tcBorders>
+            <w:tcMar>
+              <w:top w:type="dxa" w:w="80"/>
+              <w:left w:type="dxa" w:w="120"/>
+              <w:bottom w:type="dxa" w:w="80"/>
+              <w:right w:type="dxa" w:w="120"/>
+            </w:tcMar>
+          </w:tcPr>
+          <w:p>
+            <w:r>
+              <w:rPr>
+                <w:b w:val="false"/>
+                <w:bCs w:val="false"/>
+                <w:color w:val="000000"/>
+              </w:rPr>
+              <w:t xml:space="preserve">Full</w:t>
+            </w:r>
+          </w:p>
+        </w:tc>
+      </w:tr>
+      <w:tr>
+        <w:tc>
+          <w:tcPr>
+            <w:tcW w:type="dxa" w:w="3460"/>
+            <w:tcBorders>
+              <w:top w:val="single" w:color="BFC6CE" w:sz="1"/>
+              <w:left w:val="single" w:color="BFC6CE" w:sz="1"/>
+              <w:bottom w:val="single" w:color="BFC6CE" w:sz="1"/>
+              <w:right w:val="single" w:color="BFC6CE" w:sz="1"/>
+            </w:tcBorders>
+            <w:shd w:fill="EDF1F6" w:val="clear"/>
+            <w:tcMar>
+              <w:top w:type="dxa" w:w="80"/>
+              <w:left w:type="dxa" w:w="120"/>
+              <w:bottom w:type="dxa" w:w="80"/>
+              <w:right w:type="dxa" w:w="120"/>
+            </w:tcMar>
+          </w:tcPr>
+          <w:p>
+            <w:r>
+              <w:rPr>
+                <w:b/>
+                <w:bCs/>
+                <w:color w:val="000000"/>
+              </w:rPr>
+              <w:t xml:space="preserve">Partial barrier / machine screen</w:t>
+            </w:r>
+          </w:p>
+        </w:tc>
+        <w:tc>
+          <w:tcPr>
+            <w:tcW w:type="dxa" w:w="1700"/>
+            <w:tcBorders>
+              <w:top w:val="single" w:color="BFC6CE" w:sz="1"/>
+              <w:left w:val="single" w:color="BFC6CE" w:sz="1"/>
+              <w:bottom w:val="single" w:color="BFC6CE" w:sz="1"/>
+              <w:right w:val="single" w:color="BFC6CE" w:sz="1"/>
+            </w:tcBorders>
+            <w:tcMar>
+              <w:top w:type="dxa" w:w="80"/>
+              <w:left w:type="dxa" w:w="120"/>
+              <w:bottom w:type="dxa" w:w="80"/>
+              <w:right w:type="dxa" w:w="120"/>
+            </w:tcMar>
+          </w:tcPr>
+          <w:p>
+            <w:r>
+              <w:rPr>
+                <w:b w:val="false"/>
+                <w:bCs w:val="false"/>
+                <w:color w:val="000000"/>
+              </w:rPr>
+              <w:t xml:space="preserve">— (over the top)</w:t>
+            </w:r>
+          </w:p>
+        </w:tc>
+        <w:tc>
+          <w:tcPr>
+            <w:tcW w:type="dxa" w:w="1700"/>
+            <w:tcBorders>
+              <w:top w:val="single" w:color="BFC6CE" w:sz="1"/>
+              <w:left w:val="single" w:color="BFC6CE" w:sz="1"/>
+              <w:bottom w:val="single" w:color="BFC6CE" w:sz="1"/>
+              <w:right w:val="single" w:color="BFC6CE" w:sz="1"/>
+            </w:tcBorders>
+            <w:tcMar>
+              <w:top w:type="dxa" w:w="80"/>
+              <w:left w:type="dxa" w:w="120"/>
+              <w:bottom w:type="dxa" w:w="80"/>
+              <w:right w:type="dxa" w:w="120"/>
+            </w:tcMar>
+          </w:tcPr>
+          <w:p>
+            <w:r>
+              <w:rPr>
+                <w:b w:val="false"/>
+                <w:bCs w:val="false"/>
+                <w:color w:val="000000"/>
+              </w:rPr>
+              <w:t xml:space="preserve">5%</w:t>
+            </w:r>
+          </w:p>
+        </w:tc>
+        <w:tc>
+          <w:tcPr>
+            <w:tcW w:type="dxa" w:w="2500"/>
+            <w:tcBorders>
+              <w:top w:val="single" w:color="BFC6CE" w:sz="1"/>
+              <w:left w:val="single" w:color="BFC6CE" w:sz="1"/>
+              <w:bottom w:val="single" w:color="BFC6CE" w:sz="1"/>
+              <w:right w:val="single" w:color="BFC6CE" w:sz="1"/>
+            </w:tcBorders>
+            <w:tcMar>
+              <w:top w:type="dxa" w:w="80"/>
+              <w:left w:type="dxa" w:w="120"/>
+              <w:bottom w:type="dxa" w:w="80"/>
+              <w:right w:type="dxa" w:w="120"/>
+            </w:tcMar>
+          </w:tcPr>
+          <w:p>
+            <w:r>
+              <w:rPr>
+                <w:b w:val="false"/>
+                <w:bCs w:val="false"/>
+                <w:color w:val="000000"/>
+              </w:rPr>
+              <w:t xml:space="preserve">2.4 m</w:t>
+            </w:r>
+          </w:p>
+        </w:tc>
+      </w:tr>
+    </w:tbl>
+    <w:p>
+      <w:pPr>
+        <w:spacing w:before="160" w:after="0"/>
+      </w:pPr>
+      <w:r>
+        <w:rPr>
+          <w:b/>
+          <w:bCs/>
+        </w:rPr>
+        <w:t xml:space="preserve">Effect on every method. </w:t>
+      </w:r>
+      <w:r>
+        <w:t xml:space="preserve">When Measurements don’t pass through walls is ticked, the distance used by IDW, RBF and the residual correction is the shortest route around full-height walls — through doorways and other openings — instead of the straight line. A reading therefore influences the next room only through its openings, and less the longer the detour. An area that walls close off from every reading is left blank (no data). RBF cannot be solved when walls split the readings into separate groups; the tool then shows IDW and says so.</w:t>
+      </w:r>
+    </w:p>
+    <w:p>
+      <w:pPr>
+        <w:spacing w:before="120" w:after="0"/>
+      </w:pPr>
+      <w:r>
+        <w:rPr>
+          <w:b/>
+          <w:bCs/>
+        </w:rPr>
+        <w:t xml:space="preserve">Effect on the source model. </w:t>
+      </w:r>
+      <w:r>
+        <w:t xml:space="preserve">Each source reaches each location by up to four paths, which are combined by energy addition (Step 2 of Section 4.3):</w:t>
       </w:r>
     </w:p>
     <w:p>
@@ -1547,7 +2568,105 @@
         </w:numPr>
       </w:pPr>
       <w:r>
-        <w:t xml:space="preserve">All interpolated or predicted values are estimates. Verify critical boundaries (for example, the 85 dBA action level) with additional measurements.</w:t>
+        <w:rPr>
+          <w:b/>
+          <w:bCs/>
+        </w:rPr>
+        <w:t xml:space="preserve">Through walls</w:t>
+      </w:r>
+      <w:r>
+        <w:t xml:space="preserve"> — the inverse-square level minus the transmission loss of every full-height wall the straight path crosses:</w:t>
+      </w:r>
+    </w:p>
+    <w:p>
+      <w:pPr>
+        <w:spacing w:after="120" w:before="120"/>
+        <w:jc w:val="center"/>
+      </w:pPr>
+      <w:r>
+        <w:rPr>
+          <w:i/>
+          <w:iCs/>
+          <w:sz w:val="24"/>
+          <w:szCs w:val="24"/>
+        </w:rPr>
+        <w:t xml:space="preserve">L</w:t>
+      </w:r>
+      <w:r>
+        <w:rPr>
+          <w:i/>
+          <w:iCs/>
+          <w:vertAlign w:val="subscript"/>
+        </w:rPr>
+        <w:t xml:space="preserve">through</w:t>
+      </w:r>
+      <w:r>
+        <w:rPr>
+          <w:i/>
+          <w:iCs/>
+          <w:sz w:val="24"/>
+          <w:szCs w:val="24"/>
+        </w:rPr>
+        <w:t xml:space="preserve"> = L</w:t>
+      </w:r>
+      <w:r>
+        <w:rPr>
+          <w:i/>
+          <w:iCs/>
+          <w:vertAlign w:val="subscript"/>
+        </w:rPr>
+        <w:t xml:space="preserve">p1</w:t>
+      </w:r>
+      <w:r>
+        <w:rPr>
+          <w:i/>
+          <w:iCs/>
+          <w:sz w:val="24"/>
+          <w:szCs w:val="24"/>
+        </w:rPr>
+        <w:t xml:space="preserve"> − 20 · log</w:t>
+      </w:r>
+      <w:r>
+        <w:rPr>
+          <w:i/>
+          <w:iCs/>
+          <w:vertAlign w:val="subscript"/>
+        </w:rPr>
+        <w:t xml:space="preserve">10</w:t>
+      </w:r>
+      <w:r>
+        <w:rPr>
+          <w:i/>
+          <w:iCs/>
+          <w:sz w:val="24"/>
+          <w:szCs w:val="24"/>
+        </w:rPr>
+        <w:t xml:space="preserve">( r ⁄ r</w:t>
+      </w:r>
+      <w:r>
+        <w:rPr>
+          <w:i/>
+          <w:iCs/>
+          <w:vertAlign w:val="subscript"/>
+        </w:rPr>
+        <w:t xml:space="preserve">1</w:t>
+      </w:r>
+      <w:r>
+        <w:rPr>
+          <w:i/>
+          <w:iCs/>
+          <w:sz w:val="24"/>
+          <w:szCs w:val="24"/>
+        </w:rPr>
+        <w:t xml:space="preserve"> ) − Σ TL</w:t>
+      </w:r>
+      <w:r>
+        <w:rPr>
+          <w:i/>
+          <w:iCs/>
+          <w:vertAlign w:val="subscript"/>
+        </w:rPr>
+        <w:t xml:space="preserve">k</w:t>
       </w:r>
     </w:p>
     <w:p>
@@ -1559,15 +2678,514 @@
         </w:numPr>
       </w:pPr>
       <w:r>
+        <w:rPr>
+          <w:b/>
+          <w:bCs/>
+        </w:rPr>
+        <w:t xml:space="preserve">Around wall ends</w:t>
+      </w:r>
+      <w:r>
+        <w:t xml:space="preserve"> — when a full-height wall is in the way, sound also takes the shortest route of length g around the free wall ends (for example, through a doorway), screened by diffraction A(δ), where δ = g − r is the extra path length:</w:t>
+      </w:r>
+    </w:p>
+    <w:p>
+      <w:pPr>
+        <w:spacing w:after="120" w:before="120"/>
+        <w:jc w:val="center"/>
+      </w:pPr>
+      <w:r>
+        <w:rPr>
+          <w:i/>
+          <w:iCs/>
+          <w:sz w:val="24"/>
+          <w:szCs w:val="24"/>
+        </w:rPr>
+        <w:t xml:space="preserve">L</w:t>
+      </w:r>
+      <w:r>
+        <w:rPr>
+          <w:i/>
+          <w:iCs/>
+          <w:vertAlign w:val="subscript"/>
+        </w:rPr>
+        <w:t xml:space="preserve">around</w:t>
+      </w:r>
+      <w:r>
+        <w:rPr>
+          <w:i/>
+          <w:iCs/>
+          <w:sz w:val="24"/>
+          <w:szCs w:val="24"/>
+        </w:rPr>
+        <w:t xml:space="preserve"> = L</w:t>
+      </w:r>
+      <w:r>
+        <w:rPr>
+          <w:i/>
+          <w:iCs/>
+          <w:vertAlign w:val="subscript"/>
+        </w:rPr>
+        <w:t xml:space="preserve">p1</w:t>
+      </w:r>
+      <w:r>
+        <w:rPr>
+          <w:i/>
+          <w:iCs/>
+          <w:sz w:val="24"/>
+          <w:szCs w:val="24"/>
+        </w:rPr>
+        <w:t xml:space="preserve"> − 20 · log</w:t>
+      </w:r>
+      <w:r>
+        <w:rPr>
+          <w:i/>
+          <w:iCs/>
+          <w:vertAlign w:val="subscript"/>
+        </w:rPr>
+        <w:t xml:space="preserve">10</w:t>
+      </w:r>
+      <w:r>
+        <w:rPr>
+          <w:i/>
+          <w:iCs/>
+          <w:sz w:val="24"/>
+          <w:szCs w:val="24"/>
+        </w:rPr>
+        <w:t xml:space="preserve">( g ⁄ r</w:t>
+      </w:r>
+      <w:r>
+        <w:rPr>
+          <w:i/>
+          <w:iCs/>
+          <w:vertAlign w:val="subscript"/>
+        </w:rPr>
+        <w:t xml:space="preserve">1</w:t>
+      </w:r>
+      <w:r>
+        <w:rPr>
+          <w:i/>
+          <w:iCs/>
+          <w:sz w:val="24"/>
+          <w:szCs w:val="24"/>
+        </w:rPr>
+        <w:t xml:space="preserve"> ) − A(δ)</w:t>
+      </w:r>
+    </w:p>
+    <w:p>
+      <w:pPr>
+        <w:pStyle w:val="ListParagraph"/>
+        <w:numPr>
+          <w:ilvl w:val="0"/>
+          <w:numId w:val="5"/>
+        </w:numPr>
+      </w:pPr>
+      <w:r>
+        <w:rPr>
+          <w:b/>
+          <w:bCs/>
+        </w:rPr>
+        <w:t xml:space="preserve">Over partial barriers</w:t>
+      </w:r>
+      <w:r>
+        <w:t xml:space="preserve"> — screening A(δ) with the path difference over the barrier top, from the source height h</w:t>
+      </w:r>
+      <w:r>
+        <w:rPr>
+          <w:i/>
+          <w:iCs/>
+          <w:vertAlign w:val="subscript"/>
+        </w:rPr>
+        <w:t xml:space="preserve">s</w:t>
+      </w:r>
+      <w:r>
+        <w:t xml:space="preserve"> (default 1.0 m), the ear height h</w:t>
+      </w:r>
+      <w:r>
+        <w:rPr>
+          <w:i/>
+          <w:iCs/>
+          <w:vertAlign w:val="subscript"/>
+        </w:rPr>
+        <w:t xml:space="preserve">r</w:t>
+      </w:r>
+      <w:r>
+        <w:t xml:space="preserve"> (default 1.5 m), the barrier height h</w:t>
+      </w:r>
+      <w:r>
+        <w:rPr>
+          <w:i/>
+          <w:iCs/>
+          <w:vertAlign w:val="subscript"/>
+        </w:rPr>
+        <w:t xml:space="preserve">b</w:t>
+      </w:r>
+      <w:r>
+        <w:t xml:space="preserve">, and the horizontal distances a and b from the source and the receiver to the barrier:</w:t>
+      </w:r>
+    </w:p>
+    <w:p>
+      <w:pPr>
+        <w:spacing w:after="120" w:before="120"/>
+        <w:jc w:val="center"/>
+      </w:pPr>
+      <w:r>
+        <w:rPr>
+          <w:i/>
+          <w:iCs/>
+          <w:sz w:val="24"/>
+          <w:szCs w:val="24"/>
+        </w:rPr>
+        <w:t xml:space="preserve">δ = √( a² + (h</w:t>
+      </w:r>
+      <w:r>
+        <w:rPr>
+          <w:i/>
+          <w:iCs/>
+          <w:vertAlign w:val="subscript"/>
+        </w:rPr>
+        <w:t xml:space="preserve">b</w:t>
+      </w:r>
+      <w:r>
+        <w:rPr>
+          <w:i/>
+          <w:iCs/>
+          <w:sz w:val="24"/>
+          <w:szCs w:val="24"/>
+        </w:rPr>
+        <w:t xml:space="preserve"> − h</w:t>
+      </w:r>
+      <w:r>
+        <w:rPr>
+          <w:i/>
+          <w:iCs/>
+          <w:vertAlign w:val="subscript"/>
+        </w:rPr>
+        <w:t xml:space="preserve">s</w:t>
+      </w:r>
+      <w:r>
+        <w:rPr>
+          <w:i/>
+          <w:iCs/>
+          <w:sz w:val="24"/>
+          <w:szCs w:val="24"/>
+        </w:rPr>
+        <w:t xml:space="preserve">)² ) + √( b² + (h</w:t>
+      </w:r>
+      <w:r>
+        <w:rPr>
+          <w:i/>
+          <w:iCs/>
+          <w:vertAlign w:val="subscript"/>
+        </w:rPr>
+        <w:t xml:space="preserve">b</w:t>
+      </w:r>
+      <w:r>
+        <w:rPr>
+          <w:i/>
+          <w:iCs/>
+          <w:sz w:val="24"/>
+          <w:szCs w:val="24"/>
+        </w:rPr>
+        <w:t xml:space="preserve"> − h</w:t>
+      </w:r>
+      <w:r>
+        <w:rPr>
+          <w:i/>
+          <w:iCs/>
+          <w:vertAlign w:val="subscript"/>
+        </w:rPr>
+        <w:t xml:space="preserve">r</w:t>
+      </w:r>
+      <w:r>
+        <w:rPr>
+          <w:i/>
+          <w:iCs/>
+          <w:sz w:val="24"/>
+          <w:szCs w:val="24"/>
+        </w:rPr>
+        <w:t xml:space="preserve">)² ) − √( (a + b)² + (h</w:t>
+      </w:r>
+      <w:r>
+        <w:rPr>
+          <w:i/>
+          <w:iCs/>
+          <w:vertAlign w:val="subscript"/>
+        </w:rPr>
+        <w:t xml:space="preserve">r</w:t>
+      </w:r>
+      <w:r>
+        <w:rPr>
+          <w:i/>
+          <w:iCs/>
+          <w:sz w:val="24"/>
+          <w:szCs w:val="24"/>
+        </w:rPr>
+        <w:t xml:space="preserve"> − h</w:t>
+      </w:r>
+      <w:r>
+        <w:rPr>
+          <w:i/>
+          <w:iCs/>
+          <w:vertAlign w:val="subscript"/>
+        </w:rPr>
+        <w:t xml:space="preserve">s</w:t>
+      </w:r>
+      <w:r>
+        <w:rPr>
+          <w:i/>
+          <w:iCs/>
+          <w:sz w:val="24"/>
+          <w:szCs w:val="24"/>
+        </w:rPr>
+        <w:t xml:space="preserve">)² )</w:t>
+      </w:r>
+    </w:p>
+    <w:p>
+      <w:pPr>
+        <w:pStyle w:val="ListParagraph"/>
+        <w:numPr>
+          <w:ilvl w:val="0"/>
+          <w:numId w:val="5"/>
+        </w:numPr>
+      </w:pPr>
+      <w:r>
+        <w:rPr>
+          <w:b/>
+          <w:bCs/>
+        </w:rPr>
+        <w:t xml:space="preserve">Reflections</w:t>
+      </w:r>
+      <w:r>
+        <w:t xml:space="preserve"> — each wall reflects each source once. The reflection is calculated from the source’s mirror image behind the wall, at distance r′, reduced by the wall’s absorption. The mirror image is then treated like a real source: walls in its way block it, it routes around wall ends, and it fades out smoothly where the bounce point reaches the end of the wall.</w:t>
+      </w:r>
+    </w:p>
+    <w:p>
+      <w:pPr>
+        <w:spacing w:after="120" w:before="120"/>
+        <w:jc w:val="center"/>
+      </w:pPr>
+      <w:r>
+        <w:rPr>
+          <w:i/>
+          <w:iCs/>
+          <w:sz w:val="24"/>
+          <w:szCs w:val="24"/>
+        </w:rPr>
+        <w:t xml:space="preserve">L</w:t>
+      </w:r>
+      <w:r>
+        <w:rPr>
+          <w:i/>
+          <w:iCs/>
+          <w:vertAlign w:val="subscript"/>
+        </w:rPr>
+        <w:t xml:space="preserve">refl</w:t>
+      </w:r>
+      <w:r>
+        <w:rPr>
+          <w:i/>
+          <w:iCs/>
+          <w:sz w:val="24"/>
+          <w:szCs w:val="24"/>
+        </w:rPr>
+        <w:t xml:space="preserve"> = L</w:t>
+      </w:r>
+      <w:r>
+        <w:rPr>
+          <w:i/>
+          <w:iCs/>
+          <w:vertAlign w:val="subscript"/>
+        </w:rPr>
+        <w:t xml:space="preserve">p1</w:t>
+      </w:r>
+      <w:r>
+        <w:rPr>
+          <w:i/>
+          <w:iCs/>
+          <w:sz w:val="24"/>
+          <w:szCs w:val="24"/>
+        </w:rPr>
+        <w:t xml:space="preserve"> − 20 · log</w:t>
+      </w:r>
+      <w:r>
+        <w:rPr>
+          <w:i/>
+          <w:iCs/>
+          <w:vertAlign w:val="subscript"/>
+        </w:rPr>
+        <w:t xml:space="preserve">10</w:t>
+      </w:r>
+      <w:r>
+        <w:rPr>
+          <w:i/>
+          <w:iCs/>
+          <w:sz w:val="24"/>
+          <w:szCs w:val="24"/>
+        </w:rPr>
+        <w:t xml:space="preserve">( r′ ⁄ r</w:t>
+      </w:r>
+      <w:r>
+        <w:rPr>
+          <w:i/>
+          <w:iCs/>
+          <w:vertAlign w:val="subscript"/>
+        </w:rPr>
+        <w:t xml:space="preserve">1</w:t>
+      </w:r>
+      <w:r>
+        <w:rPr>
+          <w:i/>
+          <w:iCs/>
+          <w:sz w:val="24"/>
+          <w:szCs w:val="24"/>
+        </w:rPr>
+        <w:t xml:space="preserve"> ) + 10 · log</w:t>
+      </w:r>
+      <w:r>
+        <w:rPr>
+          <w:i/>
+          <w:iCs/>
+          <w:vertAlign w:val="subscript"/>
+        </w:rPr>
+        <w:t xml:space="preserve">10</w:t>
+      </w:r>
+      <w:r>
+        <w:rPr>
+          <w:i/>
+          <w:iCs/>
+          <w:sz w:val="24"/>
+          <w:szCs w:val="24"/>
+        </w:rPr>
+        <w:t xml:space="preserve">( 1 − α )</w:t>
+      </w:r>
+    </w:p>
+    <w:p>
+      <w:pPr>
+        <w:spacing w:before="120" w:after="0"/>
+      </w:pPr>
+      <w:r>
+        <w:rPr>
+          <w:b/>
+          <w:bCs/>
+        </w:rPr>
+        <w:t xml:space="preserve">Diffraction screening. </w:t>
+      </w:r>
+      <w:r>
+        <w:t xml:space="preserve">A(δ) follows Maekawa’s chart in the Kurze–Anderson form, evaluated at 500 Hz (wavelength λ = 0.686 m) as the single-frequency stand-in for A-weighted levels, with Fresnel number N = 2δ ⁄ λ, and is capped at 20 dB:</w:t>
+      </w:r>
+    </w:p>
+    <w:p>
+      <w:pPr>
+        <w:spacing w:after="120" w:before="120"/>
+        <w:jc w:val="center"/>
+      </w:pPr>
+      <w:r>
+        <w:rPr>
+          <w:i/>
+          <w:iCs/>
+          <w:sz w:val="24"/>
+          <w:szCs w:val="24"/>
+        </w:rPr>
+        <w:t xml:space="preserve">A = 5 + 20 · log</w:t>
+      </w:r>
+      <w:r>
+        <w:rPr>
+          <w:i/>
+          <w:iCs/>
+          <w:vertAlign w:val="subscript"/>
+        </w:rPr>
+        <w:t xml:space="preserve">10</w:t>
+      </w:r>
+      <w:r>
+        <w:rPr>
+          <w:i/>
+          <w:iCs/>
+          <w:sz w:val="24"/>
+          <w:szCs w:val="24"/>
+        </w:rPr>
+        <w:t xml:space="preserve">( √(2πN) ⁄ tanh √(2πN) )</w:t>
+      </w:r>
+    </w:p>
+    <w:p>
+      <w:r>
+        <w:t xml:space="preserve">On the lit side of an edge — where the path passes just beside a wall end without being blocked — N is negative and the screening fades from 5 dB at the shadow boundary to 0 dB, so levels change smoothly across the edge of a doorway. Finally, the residual correction (Step 3 of Section 4.3) is interpolated around walls in the same way, so the final map still matches every reading exactly. The companion Python module noise_model.py contains the same wall model (verified to match the app).</w:t>
+      </w:r>
+    </w:p>
+    <w:p>
+      <w:pPr>
+        <w:pStyle w:val="Heading2"/>
+      </w:pPr>
+      <w:r>
+        <w:t xml:space="preserve">4.5 Assumptions and limitations</w:t>
+      </w:r>
+    </w:p>
+    <w:p>
+      <w:pPr>
+        <w:pStyle w:val="ListParagraph"/>
+        <w:numPr>
+          <w:ilvl w:val="0"/>
+          <w:numId w:val="5"/>
+        </w:numPr>
+      </w:pPr>
+      <w:r>
+        <w:t xml:space="preserve">Sources are idealized points in a free field. Large machines behave as line or area sources, and reverberant rooms decay more slowly than 6 dB per doubling — indoors the model is a baseline, not an exact solution.</w:t>
+      </w:r>
+    </w:p>
+    <w:p>
+      <w:pPr>
+        <w:pStyle w:val="ListParagraph"/>
+        <w:numPr>
+          <w:ilvl w:val="0"/>
+          <w:numId w:val="5"/>
+        </w:numPr>
+      </w:pPr>
+      <w:r>
+        <w:t xml:space="preserve">Steady-state A-weighted levels are assumed; impulsive noise, tonal character, and duty-cycle variation are not modeled.</w:t>
+      </w:r>
+    </w:p>
+    <w:p>
+      <w:pPr>
+        <w:pStyle w:val="ListParagraph"/>
+        <w:numPr>
+          <w:ilvl w:val="0"/>
+          <w:numId w:val="5"/>
+        </w:numPr>
+      </w:pPr>
+      <w:r>
+        <w:t xml:space="preserve">Walls are modeled in 2-D with single-number (dBA) values: one reflection per wall, no reflections from the floor or ceiling, and no reverberant build-up of sound in the room. Real walls and barriers block high-pitched noise better than low rumble. Through doorways the model can show line-of-sight “beams” that reverberation would partly fill in. Residual correction compensates, mainly near the measurements.</w:t>
+      </w:r>
+    </w:p>
+    <w:p>
+      <w:pPr>
+        <w:pStyle w:val="ListParagraph"/>
+        <w:numPr>
+          <w:ilvl w:val="0"/>
+          <w:numId w:val="5"/>
+        </w:numPr>
+      </w:pPr>
+      <w:r>
+        <w:t xml:space="preserve">All interpolated or predicted values are estimates. Verify critical boundaries (for example, the 85 dBA action level) with additional measurements.</w:t>
+      </w:r>
+    </w:p>
+    <w:p>
+      <w:pPr>
+        <w:pStyle w:val="ListParagraph"/>
+        <w:numPr>
+          <w:ilvl w:val="0"/>
+          <w:numId w:val="5"/>
+        </w:numPr>
+      </w:pPr>
+      <w:r>
         <w:t xml:space="preserve">The maps support area noise assessment, planning, and stakeholder communication. They are not a substitute for personal noise dosimetry or regulatory exposure determination.</w:t>
       </w:r>
     </w:p>
     <w:p>
       <w:pPr>
         <w:pStyle w:val="Heading2"/>
-      </w:pPr>
-      <w:r>
-        <w:t xml:space="preserve">4.5 Choosing a method</w:t>
+        <w:pageBreakBefore/>
+      </w:pPr>
+      <w:r>
+        <w:t xml:space="preserve">4.6 Choosing a method</w:t>
       </w:r>
     </w:p>
     <w:tbl>
@@ -1920,7 +3538,7 @@
                 <w:bCs w:val="false"/>
                 <w:color w:val="000000"/>
               </w:rPr>
-              <w:t xml:space="preserve">Needs a calibrated scale and reliable source levels; distance-only physics indoors</w:t>
+              <w:t xml:space="preserve">Needs a calibrated scale and reliable source levels; first-order wall model with no reverberation</w:t>
             </w:r>
           </w:p>
         </w:tc>
@@ -2290,6 +3908,177 @@
                 <w:color w:val="000000"/>
               </w:rPr>
               <w:t xml:space="preserve">The source model needs a calibrated scale (Section 6 in the sidebar) and at least one noise source placed with the Add source tool. Measurement points are optional but recommended — they calibrate the prediction.</w:t>
+            </w:r>
+          </w:p>
+        </w:tc>
+      </w:tr>
+      <w:tr>
+        <w:tc>
+          <w:tcPr>
+            <w:tcW w:type="dxa" w:w="3500"/>
+            <w:tcBorders>
+              <w:top w:val="single" w:color="BFC6CE" w:sz="1"/>
+              <w:left w:val="single" w:color="BFC6CE" w:sz="1"/>
+              <w:bottom w:val="single" w:color="BFC6CE" w:sz="1"/>
+              <w:right w:val="single" w:color="BFC6CE" w:sz="1"/>
+            </w:tcBorders>
+            <w:shd w:fill="EDF1F6" w:val="clear"/>
+            <w:tcMar>
+              <w:top w:type="dxa" w:w="80"/>
+              <w:left w:type="dxa" w:w="120"/>
+              <w:bottom w:type="dxa" w:w="80"/>
+              <w:right w:type="dxa" w:w="120"/>
+            </w:tcMar>
+          </w:tcPr>
+          <w:p>
+            <w:r>
+              <w:rPr>
+                <w:b/>
+                <w:bCs/>
+                <w:color w:val="000000"/>
+              </w:rPr>
+              <w:t xml:space="preserve">Part of the map is blank after drawing walls</w:t>
+            </w:r>
+          </w:p>
+        </w:tc>
+        <w:tc>
+          <w:tcPr>
+            <w:tcW w:type="dxa" w:w="5860"/>
+            <w:tcBorders>
+              <w:top w:val="single" w:color="BFC6CE" w:sz="1"/>
+              <w:left w:val="single" w:color="BFC6CE" w:sz="1"/>
+              <w:bottom w:val="single" w:color="BFC6CE" w:sz="1"/>
+              <w:right w:val="single" w:color="BFC6CE" w:sz="1"/>
+            </w:tcBorders>
+            <w:tcMar>
+              <w:top w:type="dxa" w:w="80"/>
+              <w:left w:type="dxa" w:w="120"/>
+              <w:bottom w:type="dxa" w:w="80"/>
+              <w:right w:type="dxa" w:w="120"/>
+            </w:tcMar>
+          </w:tcPr>
+          <w:p>
+            <w:r>
+              <w:rPr>
+                <w:b w:val="false"/>
+                <w:bCs w:val="false"/>
+                <w:color w:val="000000"/>
+              </w:rPr>
+              <w:t xml:space="preserve">Walls close that area off from all your readings. Add a reading there, leave a gap for the doorway, or untick Measurements don’t pass through walls (sidebar section 3).</w:t>
+            </w:r>
+          </w:p>
+        </w:tc>
+      </w:tr>
+      <w:tr>
+        <w:tc>
+          <w:tcPr>
+            <w:tcW w:type="dxa" w:w="3500"/>
+            <w:tcBorders>
+              <w:top w:val="single" w:color="BFC6CE" w:sz="1"/>
+              <w:left w:val="single" w:color="BFC6CE" w:sz="1"/>
+              <w:bottom w:val="single" w:color="BFC6CE" w:sz="1"/>
+              <w:right w:val="single" w:color="BFC6CE" w:sz="1"/>
+            </w:tcBorders>
+            <w:shd w:fill="EDF1F6" w:val="clear"/>
+            <w:tcMar>
+              <w:top w:type="dxa" w:w="80"/>
+              <w:left w:type="dxa" w:w="120"/>
+              <w:bottom w:type="dxa" w:w="80"/>
+              <w:right w:type="dxa" w:w="120"/>
+            </w:tcMar>
+          </w:tcPr>
+          <w:p>
+            <w:r>
+              <w:rPr>
+                <w:b/>
+                <w:bCs/>
+                <w:color w:val="000000"/>
+              </w:rPr>
+              <w:t xml:space="preserve">Color “leaks” through a wall</w:t>
+            </w:r>
+          </w:p>
+        </w:tc>
+        <w:tc>
+          <w:tcPr>
+            <w:tcW w:type="dxa" w:w="5860"/>
+            <w:tcBorders>
+              <w:top w:val="single" w:color="BFC6CE" w:sz="1"/>
+              <w:left w:val="single" w:color="BFC6CE" w:sz="1"/>
+              <w:bottom w:val="single" w:color="BFC6CE" w:sz="1"/>
+              <w:right w:val="single" w:color="BFC6CE" w:sz="1"/>
+            </w:tcBorders>
+            <w:tcMar>
+              <w:top w:type="dxa" w:w="80"/>
+              <w:left w:type="dxa" w:w="120"/>
+              <w:bottom w:type="dxa" w:w="80"/>
+              <w:right w:type="dxa" w:w="120"/>
+            </w:tcMar>
+          </w:tcPr>
+          <w:p>
+            <w:r>
+              <w:rPr>
+                <w:b w:val="false"/>
+                <w:bCs w:val="false"/>
+                <w:color w:val="000000"/>
+              </w:rPr>
+              <w:t xml:space="preserve">A corner probably has a small gap. In Pan mode, drag the wall end onto the other wall until the pink snap circle appears.</w:t>
+            </w:r>
+          </w:p>
+        </w:tc>
+      </w:tr>
+      <w:tr>
+        <w:tc>
+          <w:tcPr>
+            <w:tcW w:type="dxa" w:w="3500"/>
+            <w:tcBorders>
+              <w:top w:val="single" w:color="BFC6CE" w:sz="1"/>
+              <w:left w:val="single" w:color="BFC6CE" w:sz="1"/>
+              <w:bottom w:val="single" w:color="BFC6CE" w:sz="1"/>
+              <w:right w:val="single" w:color="BFC6CE" w:sz="1"/>
+            </w:tcBorders>
+            <w:shd w:fill="EDF1F6" w:val="clear"/>
+            <w:tcMar>
+              <w:top w:type="dxa" w:w="80"/>
+              <w:left w:type="dxa" w:w="120"/>
+              <w:bottom w:type="dxa" w:w="80"/>
+              <w:right w:type="dxa" w:w="120"/>
+            </w:tcMar>
+          </w:tcPr>
+          <w:p>
+            <w:r>
+              <w:rPr>
+                <w:b/>
+                <w:bCs/>
+                <w:color w:val="000000"/>
+              </w:rPr>
+              <w:t xml:space="preserve">Walls make no difference to the map</w:t>
+            </w:r>
+          </w:p>
+        </w:tc>
+        <w:tc>
+          <w:tcPr>
+            <w:tcW w:type="dxa" w:w="5860"/>
+            <w:tcBorders>
+              <w:top w:val="single" w:color="BFC6CE" w:sz="1"/>
+              <w:left w:val="single" w:color="BFC6CE" w:sz="1"/>
+              <w:bottom w:val="single" w:color="BFC6CE" w:sz="1"/>
+              <w:right w:val="single" w:color="BFC6CE" w:sz="1"/>
+            </w:tcBorders>
+            <w:tcMar>
+              <w:top w:type="dxa" w:w="80"/>
+              <w:left w:type="dxa" w:w="120"/>
+              <w:bottom w:type="dxa" w:w="80"/>
+              <w:right w:type="dxa" w:w="120"/>
+            </w:tcMar>
+          </w:tcPr>
+          <w:p>
+            <w:r>
+              <w:rPr>
+                <w:b w:val="false"/>
+                <w:bCs w:val="false"/>
+                <w:color w:val="000000"/>
+              </w:rPr>
+              <w:t xml:space="preserve">Check the wall settings in sidebar section 3. Blocking and reflections apply to the source model only; IDW and RBF use walls to stop readings passing through them.</w:t>
             </w:r>
           </w:p>
         </w:tc>

</xml_diff>

<commit_message>
Add rooms and reverberation (v1.2.0)
Rooms are drawn as outlines with a ceiling height and a finish preset
(average absorption); the Sabine reverberation time is shown and a
measured value can set the absorption. In the source model each room adds
its reverberant field, Lrev = Lw + 10log10(4/R), with rooms coupled
through the doorways and walls on their shared edges (found by sampling
each edge; doorway height for gaps up to 8 m, open plan beyond) and fed by
direct sound arriving from machines in other rooms. One isolated room
reduces exactly to the textbook formula. With rooms, residual corrections
stay within each room that has readings.

noise_model.py gains the same model (section 10), matching the app to
~1e-14 dB on the demo. The demo has six rooms; the in-app guide, README
and installation guide (v1.2.0) are updated.

Co-Authored-By: Claude Opus 5.5 <noreply@anthropic.com>
</commit_message>
<xml_diff>
--- a/Noise Contour Mapper - Installation Guide.docx
+++ b/Noise Contour Mapper - Installation Guide.docx
@@ -43,7 +43,7 @@
           <w:sz w:val="20"/>
           <w:szCs w:val="20"/>
         </w:rPr>
-        <w:t xml:space="preserve">Version 1.1.0   ·   October 2026   ·   Internal pilot</w:t>
+        <w:t xml:space="preserve">Version 1.2.0   ·   October 2026   ·   Internal pilot</w:t>
       </w:r>
     </w:p>
     <w:p>
@@ -656,10 +656,10 @@
           <w:b/>
           <w:bCs/>
         </w:rPr>
-        <w:t xml:space="preserve">Calculation and display</w:t>
-      </w:r>
-      <w:r>
-        <w:t xml:space="preserve"> — the noise map updates live. Choose inverse distance weighting (IDW), radial basis interpolation, or the source model (below); adjust the color bands (defaults: &lt;80, 80–85, 85–90, 90–95, &gt;95 dBA), opacity, and contour lines. Section 3 also holds the wall settings: Measurements don’t pass through walls, Walls block sound, Walls reflect sound, and the machine and ear heights used for partial barriers.</w:t>
+        <w:t xml:space="preserve">Rooms and reverberation (optional)</w:t>
+      </w:r>
+      <w:r>
+        <w:t xml:space="preserve"> — click Draw room in the toolbar (or press R) and click each corner of a room, then click the first corner again or double-click to close it; Esc cancels. Corners snap onto walls and onto other rooms’ corners. Let neighboring rooms share their edges: the tool finds the doorways between rooms from the gaps in the walls along those edges. In sidebar section 2d, set each room’s ceiling height and finish, or type a measured reverberation time. Section 4.5 explains the calculation.</w:t>
       </w:r>
     </w:p>
     <w:p>
@@ -675,30 +675,49 @@
           <w:b/>
           <w:bCs/>
         </w:rPr>
-        <w:t xml:space="preserve">Source model + residuals (optional)</w:t>
-      </w:r>
-      <w:r>
-        <w:t xml:space="preserve"> — instead of interpolating between measurements only, place known equipment as noise sources: click </w:t>
-      </w:r>
+        <w:t xml:space="preserve">Calculation and display</w:t>
+      </w:r>
+      <w:r>
+        <w:t xml:space="preserve"> — the noise map updates live. Choose inverse distance weighting (IDW), radial basis interpolation, or the source model (below); adjust the color bands (defaults: &lt;80, 80–85, 85–90, 90–95, &gt;95 dBA), opacity, and contour lines. Section 3 also holds the wall settings: Measurements don’t pass through walls, Walls block sound, Walls reflect sound, and the machine and ear heights used for partial barriers — plus Room reverberation and the Doorway height.</w:t>
+      </w:r>
+    </w:p>
+    <w:p>
+      <w:pPr>
+        <w:pStyle w:val="ListParagraph"/>
+        <w:numPr>
+          <w:ilvl w:val="0"/>
+          <w:numId w:val="5"/>
+        </w:numPr>
+      </w:pPr>
       <w:r>
         <w:rPr>
           <w:b/>
           <w:bCs/>
         </w:rPr>
-        <w:t xml:space="preserve">Add source</w:t>
-      </w:r>
-      <w:r>
-        <w:t xml:space="preserve"> in the toolbar, click the machine's location, and enter its sound level at a reference distance (e.g., 92 dBA at 1 m from a nameplate or close-up reading). Then set the calculation method to </w:t>
+        <w:t xml:space="preserve">Source model + residuals (optional)</w:t>
+      </w:r>
+      <w:r>
+        <w:t xml:space="preserve"> — instead of interpolating between measurements only, place known equipment as noise sources: click </w:t>
       </w:r>
       <w:r>
         <w:rPr>
           <w:b/>
           <w:bCs/>
         </w:rPr>
+        <w:t xml:space="preserve">Add source</w:t>
+      </w:r>
+      <w:r>
+        <w:t xml:space="preserve"> in the toolbar, click the machine's location, and enter its sound level at a reference distance (e.g., 92 dBA at 1 m from a nameplate or close-up reading). Then set the calculation method to </w:t>
+      </w:r>
+      <w:r>
+        <w:rPr>
+          <w:b/>
+          <w:bCs/>
+        </w:rPr>
         <w:t xml:space="preserve">Source model + residuals</w:t>
       </w:r>
       <w:r>
-        <w:t xml:space="preserve">. The tool predicts levels physically (inverse square law, energies added logarithmically) and calibrates the prediction so it matches your SLM readings exactly at each measurement point. Requires a calibrated scale. Sources appear as orange diamonds and can be dragged; their levels are edited in sidebar section 2b. The result is a planning and visualization aid — not a replacement for personal dosimetry or regulatory exposure assessment. With walls drawn, the prediction also includes blocking, sound bending around walls and over barriers, and reflections (Section 4.4).</w:t>
+        <w:t xml:space="preserve">. The tool predicts levels physically (inverse square law, energies added logarithmically) and calibrates the prediction so it matches your SLM readings exactly at each measurement point. Requires a calibrated scale. Sources appear as orange diamonds and can be dragged; their levels are edited in sidebar section 2b. The result is a planning and visualization aid — not a replacement for personal dosimetry or regulatory exposure assessment. With walls drawn, the prediction also includes blocking, sound bending around walls and over barriers, and reflections (Section 4.4); with rooms drawn, it adds each room’s reverberation (Section 4.5).</w:t>
       </w:r>
     </w:p>
     <w:p>
@@ -779,7 +798,7 @@
           <w:sz w:val="18"/>
           <w:szCs w:val="18"/>
         </w:rPr>
-        <w:t xml:space="preserve">The demo facility using the source model with walls (exported map): dark lines are walls, with gaps for doorways; teal lines are walls lined with acoustic panels; the dashed brown line is a partial barrier. Orange diamonds are noise sources (two presses and a compressor); circles are SLM measurement points.</w:t>
+        <w:t xml:space="preserve">The demo facility using the source model with walls (exported map): dark lines are walls, with gaps for doorways; teal lines are walls lined with acoustic panels; the dashed brown line is a partial barrier; dashed blue outlines are rooms, each adding its own reverberation. Orange diamonds are noise sources (two presses and a compressor); circles are SLM measurement points.</w:t>
       </w:r>
     </w:p>
     <w:tbl>
@@ -3116,7 +3135,1132 @@
         <w:pStyle w:val="Heading2"/>
       </w:pPr>
       <w:r>
-        <w:t xml:space="preserve">4.5 Assumptions and limitations</w:t>
+        <w:t xml:space="preserve">4.5 Rooms and reverberation</w:t>
+      </w:r>
+    </w:p>
+    <w:p>
+      <w:pPr>
+        <w:spacing w:before="0" w:after="160"/>
+      </w:pPr>
+      <w:r>
+        <w:t xml:space="preserve">Indoors, sound reflects many times from the walls, floor and ceiling. Away from the machines this reverberant sound dominates and is nearly the same everywhere in a room, so levels stop falling by 6 dB per doubling of distance. Rooms are drawn as outlines on the plan (the Draw room tool, sidebar section 2d). Each has a ceiling height h and an average absorption coefficient α, chosen from a finish preset or set from a measured reverberation time:</w:t>
+      </w:r>
+    </w:p>
+    <w:tbl>
+      <w:tblPr>
+        <w:tblW w:type="dxa" w:w="9360"/>
+        <w:tblBorders>
+          <w:top w:val="single" w:color="auto" w:sz="4"/>
+          <w:left w:val="single" w:color="auto" w:sz="4"/>
+          <w:bottom w:val="single" w:color="auto" w:sz="4"/>
+          <w:right w:val="single" w:color="auto" w:sz="4"/>
+          <w:insideH w:val="single" w:color="auto" w:sz="4"/>
+          <w:insideV w:val="single" w:color="auto" w:sz="4"/>
+        </w:tblBorders>
+      </w:tblPr>
+      <w:tblGrid>
+        <w:gridCol w:w="4360"/>
+        <w:gridCol w:w="1500"/>
+        <w:gridCol w:w="3500"/>
+      </w:tblGrid>
+      <w:tr>
+        <w:tc>
+          <w:tcPr>
+            <w:tcW w:type="dxa" w:w="4360"/>
+            <w:tcBorders>
+              <w:top w:val="single" w:color="BFC6CE" w:sz="1"/>
+              <w:left w:val="single" w:color="BFC6CE" w:sz="1"/>
+              <w:bottom w:val="single" w:color="BFC6CE" w:sz="1"/>
+              <w:right w:val="single" w:color="BFC6CE" w:sz="1"/>
+            </w:tcBorders>
+            <w:shd w:fill="1A355E" w:val="clear"/>
+            <w:tcMar>
+              <w:top w:type="dxa" w:w="80"/>
+              <w:left w:type="dxa" w:w="120"/>
+              <w:bottom w:type="dxa" w:w="80"/>
+              <w:right w:type="dxa" w:w="120"/>
+            </w:tcMar>
+          </w:tcPr>
+          <w:p>
+            <w:pPr>
+              <w:keepNext/>
+            </w:pPr>
+            <w:r>
+              <w:rPr>
+                <w:b/>
+                <w:bCs/>
+                <w:color w:val="FFFFFF"/>
+              </w:rPr>
+              <w:t xml:space="preserve">Room finish</w:t>
+            </w:r>
+          </w:p>
+        </w:tc>
+        <w:tc>
+          <w:tcPr>
+            <w:tcW w:type="dxa" w:w="1500"/>
+            <w:tcBorders>
+              <w:top w:val="single" w:color="BFC6CE" w:sz="1"/>
+              <w:left w:val="single" w:color="BFC6CE" w:sz="1"/>
+              <w:bottom w:val="single" w:color="BFC6CE" w:sz="1"/>
+              <w:right w:val="single" w:color="BFC6CE" w:sz="1"/>
+            </w:tcBorders>
+            <w:shd w:fill="1A355E" w:val="clear"/>
+            <w:tcMar>
+              <w:top w:type="dxa" w:w="80"/>
+              <w:left w:type="dxa" w:w="120"/>
+              <w:bottom w:type="dxa" w:w="80"/>
+              <w:right w:type="dxa" w:w="120"/>
+            </w:tcMar>
+          </w:tcPr>
+          <w:p>
+            <w:pPr>
+              <w:keepNext/>
+            </w:pPr>
+            <w:r>
+              <w:rPr>
+                <w:b/>
+                <w:bCs/>
+                <w:color w:val="FFFFFF"/>
+              </w:rPr>
+              <w:t xml:space="preserve">Absorption α</w:t>
+            </w:r>
+          </w:p>
+        </w:tc>
+        <w:tc>
+          <w:tcPr>
+            <w:tcW w:type="dxa" w:w="3500"/>
+            <w:tcBorders>
+              <w:top w:val="single" w:color="BFC6CE" w:sz="1"/>
+              <w:left w:val="single" w:color="BFC6CE" w:sz="1"/>
+              <w:bottom w:val="single" w:color="BFC6CE" w:sz="1"/>
+              <w:right w:val="single" w:color="BFC6CE" w:sz="1"/>
+            </w:tcBorders>
+            <w:shd w:fill="1A355E" w:val="clear"/>
+            <w:tcMar>
+              <w:top w:type="dxa" w:w="80"/>
+              <w:left w:type="dxa" w:w="120"/>
+              <w:bottom w:type="dxa" w:w="80"/>
+              <w:right w:type="dxa" w:w="120"/>
+            </w:tcMar>
+          </w:tcPr>
+          <w:p>
+            <w:pPr>
+              <w:keepNext/>
+            </w:pPr>
+            <w:r>
+              <w:rPr>
+                <w:b/>
+                <w:bCs/>
+                <w:color w:val="FFFFFF"/>
+              </w:rPr>
+              <w:t xml:space="preserve">Reverberation time, 30 × 30 m room, 6 m high</w:t>
+            </w:r>
+          </w:p>
+        </w:tc>
+      </w:tr>
+      <w:tr>
+        <w:tc>
+          <w:tcPr>
+            <w:tcW w:type="dxa" w:w="4360"/>
+            <w:tcBorders>
+              <w:top w:val="single" w:color="BFC6CE" w:sz="1"/>
+              <w:left w:val="single" w:color="BFC6CE" w:sz="1"/>
+              <w:bottom w:val="single" w:color="BFC6CE" w:sz="1"/>
+              <w:right w:val="single" w:color="BFC6CE" w:sz="1"/>
+            </w:tcBorders>
+            <w:shd w:fill="EDF1F6" w:val="clear"/>
+            <w:tcMar>
+              <w:top w:type="dxa" w:w="80"/>
+              <w:left w:type="dxa" w:w="120"/>
+              <w:bottom w:type="dxa" w:w="80"/>
+              <w:right w:type="dxa" w:w="120"/>
+            </w:tcMar>
+          </w:tcPr>
+          <w:p>
+            <w:pPr>
+              <w:keepNext/>
+            </w:pPr>
+            <w:r>
+              <w:rPr>
+                <w:b/>
+                <w:bCs/>
+                <w:color w:val="000000"/>
+              </w:rPr>
+              <w:t xml:space="preserve">Hard: bare concrete or metal, few contents</w:t>
+            </w:r>
+          </w:p>
+        </w:tc>
+        <w:tc>
+          <w:tcPr>
+            <w:tcW w:type="dxa" w:w="1500"/>
+            <w:tcBorders>
+              <w:top w:val="single" w:color="BFC6CE" w:sz="1"/>
+              <w:left w:val="single" w:color="BFC6CE" w:sz="1"/>
+              <w:bottom w:val="single" w:color="BFC6CE" w:sz="1"/>
+              <w:right w:val="single" w:color="BFC6CE" w:sz="1"/>
+            </w:tcBorders>
+            <w:tcMar>
+              <w:top w:type="dxa" w:w="80"/>
+              <w:left w:type="dxa" w:w="120"/>
+              <w:bottom w:type="dxa" w:w="80"/>
+              <w:right w:type="dxa" w:w="120"/>
+            </w:tcMar>
+          </w:tcPr>
+          <w:p>
+            <w:pPr>
+              <w:keepNext/>
+            </w:pPr>
+            <w:r>
+              <w:rPr>
+                <w:b w:val="false"/>
+                <w:bCs w:val="false"/>
+                <w:color w:val="000000"/>
+              </w:rPr>
+              <w:t xml:space="preserve">0.05</w:t>
+            </w:r>
+          </w:p>
+        </w:tc>
+        <w:tc>
+          <w:tcPr>
+            <w:tcW w:type="dxa" w:w="3500"/>
+            <w:tcBorders>
+              <w:top w:val="single" w:color="BFC6CE" w:sz="1"/>
+              <w:left w:val="single" w:color="BFC6CE" w:sz="1"/>
+              <w:bottom w:val="single" w:color="BFC6CE" w:sz="1"/>
+              <w:right w:val="single" w:color="BFC6CE" w:sz="1"/>
+            </w:tcBorders>
+            <w:tcMar>
+              <w:top w:type="dxa" w:w="80"/>
+              <w:left w:type="dxa" w:w="120"/>
+              <w:bottom w:type="dxa" w:w="80"/>
+              <w:right w:type="dxa" w:w="120"/>
+            </w:tcMar>
+          </w:tcPr>
+          <w:p>
+            <w:pPr>
+              <w:keepNext/>
+            </w:pPr>
+            <w:r>
+              <w:rPr>
+                <w:b w:val="false"/>
+                <w:bCs w:val="false"/>
+                <w:color w:val="000000"/>
+              </w:rPr>
+              <w:t xml:space="preserve">about 7 s</w:t>
+            </w:r>
+          </w:p>
+        </w:tc>
+      </w:tr>
+      <w:tr>
+        <w:tc>
+          <w:tcPr>
+            <w:tcW w:type="dxa" w:w="4360"/>
+            <w:tcBorders>
+              <w:top w:val="single" w:color="BFC6CE" w:sz="1"/>
+              <w:left w:val="single" w:color="BFC6CE" w:sz="1"/>
+              <w:bottom w:val="single" w:color="BFC6CE" w:sz="1"/>
+              <w:right w:val="single" w:color="BFC6CE" w:sz="1"/>
+            </w:tcBorders>
+            <w:shd w:fill="EDF1F6" w:val="clear"/>
+            <w:tcMar>
+              <w:top w:type="dxa" w:w="80"/>
+              <w:left w:type="dxa" w:w="120"/>
+              <w:bottom w:type="dxa" w:w="80"/>
+              <w:right w:type="dxa" w:w="120"/>
+            </w:tcMar>
+          </w:tcPr>
+          <w:p>
+            <w:pPr>
+              <w:keepNext/>
+            </w:pPr>
+            <w:r>
+              <w:rPr>
+                <w:b/>
+                <w:bCs/>
+                <w:color w:val="000000"/>
+              </w:rPr>
+              <w:t xml:space="preserve">Typical factory: machinery and stock</w:t>
+            </w:r>
+          </w:p>
+        </w:tc>
+        <w:tc>
+          <w:tcPr>
+            <w:tcW w:type="dxa" w:w="1500"/>
+            <w:tcBorders>
+              <w:top w:val="single" w:color="BFC6CE" w:sz="1"/>
+              <w:left w:val="single" w:color="BFC6CE" w:sz="1"/>
+              <w:bottom w:val="single" w:color="BFC6CE" w:sz="1"/>
+              <w:right w:val="single" w:color="BFC6CE" w:sz="1"/>
+            </w:tcBorders>
+            <w:tcMar>
+              <w:top w:type="dxa" w:w="80"/>
+              <w:left w:type="dxa" w:w="120"/>
+              <w:bottom w:type="dxa" w:w="80"/>
+              <w:right w:type="dxa" w:w="120"/>
+            </w:tcMar>
+          </w:tcPr>
+          <w:p>
+            <w:pPr>
+              <w:keepNext/>
+            </w:pPr>
+            <w:r>
+              <w:rPr>
+                <w:b w:val="false"/>
+                <w:bCs w:val="false"/>
+                <w:color w:val="000000"/>
+              </w:rPr>
+              <w:t xml:space="preserve">0.10</w:t>
+            </w:r>
+          </w:p>
+        </w:tc>
+        <w:tc>
+          <w:tcPr>
+            <w:tcW w:type="dxa" w:w="3500"/>
+            <w:tcBorders>
+              <w:top w:val="single" w:color="BFC6CE" w:sz="1"/>
+              <w:left w:val="single" w:color="BFC6CE" w:sz="1"/>
+              <w:bottom w:val="single" w:color="BFC6CE" w:sz="1"/>
+              <w:right w:val="single" w:color="BFC6CE" w:sz="1"/>
+            </w:tcBorders>
+            <w:tcMar>
+              <w:top w:type="dxa" w:w="80"/>
+              <w:left w:type="dxa" w:w="120"/>
+              <w:bottom w:type="dxa" w:w="80"/>
+              <w:right w:type="dxa" w:w="120"/>
+            </w:tcMar>
+          </w:tcPr>
+          <w:p>
+            <w:pPr>
+              <w:keepNext/>
+            </w:pPr>
+            <w:r>
+              <w:rPr>
+                <w:b w:val="false"/>
+                <w:bCs w:val="false"/>
+                <w:color w:val="000000"/>
+              </w:rPr>
+              <w:t xml:space="preserve">about 3.4 s</w:t>
+            </w:r>
+          </w:p>
+        </w:tc>
+      </w:tr>
+      <w:tr>
+        <w:tc>
+          <w:tcPr>
+            <w:tcW w:type="dxa" w:w="4360"/>
+            <w:tcBorders>
+              <w:top w:val="single" w:color="BFC6CE" w:sz="1"/>
+              <w:left w:val="single" w:color="BFC6CE" w:sz="1"/>
+              <w:bottom w:val="single" w:color="BFC6CE" w:sz="1"/>
+              <w:right w:val="single" w:color="BFC6CE" w:sz="1"/>
+            </w:tcBorders>
+            <w:shd w:fill="EDF1F6" w:val="clear"/>
+            <w:tcMar>
+              <w:top w:type="dxa" w:w="80"/>
+              <w:left w:type="dxa" w:w="120"/>
+              <w:bottom w:type="dxa" w:w="80"/>
+              <w:right w:type="dxa" w:w="120"/>
+            </w:tcMar>
+          </w:tcPr>
+          <w:p>
+            <w:pPr>
+              <w:keepNext/>
+            </w:pPr>
+            <w:r>
+              <w:rPr>
+                <w:b/>
+                <w:bCs/>
+                <w:color w:val="000000"/>
+              </w:rPr>
+              <w:t xml:space="preserve">Partly treated: e.g. insulated roof</w:t>
+            </w:r>
+          </w:p>
+        </w:tc>
+        <w:tc>
+          <w:tcPr>
+            <w:tcW w:type="dxa" w:w="1500"/>
+            <w:tcBorders>
+              <w:top w:val="single" w:color="BFC6CE" w:sz="1"/>
+              <w:left w:val="single" w:color="BFC6CE" w:sz="1"/>
+              <w:bottom w:val="single" w:color="BFC6CE" w:sz="1"/>
+              <w:right w:val="single" w:color="BFC6CE" w:sz="1"/>
+            </w:tcBorders>
+            <w:tcMar>
+              <w:top w:type="dxa" w:w="80"/>
+              <w:left w:type="dxa" w:w="120"/>
+              <w:bottom w:type="dxa" w:w="80"/>
+              <w:right w:type="dxa" w:w="120"/>
+            </w:tcMar>
+          </w:tcPr>
+          <w:p>
+            <w:pPr>
+              <w:keepNext/>
+            </w:pPr>
+            <w:r>
+              <w:rPr>
+                <w:b w:val="false"/>
+                <w:bCs w:val="false"/>
+                <w:color w:val="000000"/>
+              </w:rPr>
+              <w:t xml:space="preserve">0.20</w:t>
+            </w:r>
+          </w:p>
+        </w:tc>
+        <w:tc>
+          <w:tcPr>
+            <w:tcW w:type="dxa" w:w="3500"/>
+            <w:tcBorders>
+              <w:top w:val="single" w:color="BFC6CE" w:sz="1"/>
+              <w:left w:val="single" w:color="BFC6CE" w:sz="1"/>
+              <w:bottom w:val="single" w:color="BFC6CE" w:sz="1"/>
+              <w:right w:val="single" w:color="BFC6CE" w:sz="1"/>
+            </w:tcBorders>
+            <w:tcMar>
+              <w:top w:type="dxa" w:w="80"/>
+              <w:left w:type="dxa" w:w="120"/>
+              <w:bottom w:type="dxa" w:w="80"/>
+              <w:right w:type="dxa" w:w="120"/>
+            </w:tcMar>
+          </w:tcPr>
+          <w:p>
+            <w:pPr>
+              <w:keepNext/>
+            </w:pPr>
+            <w:r>
+              <w:rPr>
+                <w:b w:val="false"/>
+                <w:bCs w:val="false"/>
+                <w:color w:val="000000"/>
+              </w:rPr>
+              <w:t xml:space="preserve">about 1.7 s</w:t>
+            </w:r>
+          </w:p>
+        </w:tc>
+      </w:tr>
+      <w:tr>
+        <w:tc>
+          <w:tcPr>
+            <w:tcW w:type="dxa" w:w="4360"/>
+            <w:tcBorders>
+              <w:top w:val="single" w:color="BFC6CE" w:sz="1"/>
+              <w:left w:val="single" w:color="BFC6CE" w:sz="1"/>
+              <w:bottom w:val="single" w:color="BFC6CE" w:sz="1"/>
+              <w:right w:val="single" w:color="BFC6CE" w:sz="1"/>
+            </w:tcBorders>
+            <w:shd w:fill="EDF1F6" w:val="clear"/>
+            <w:tcMar>
+              <w:top w:type="dxa" w:w="80"/>
+              <w:left w:type="dxa" w:w="120"/>
+              <w:bottom w:type="dxa" w:w="80"/>
+              <w:right w:type="dxa" w:w="120"/>
+            </w:tcMar>
+          </w:tcPr>
+          <w:p>
+            <w:pPr>
+              <w:keepNext/>
+            </w:pPr>
+            <w:r>
+              <w:rPr>
+                <w:b/>
+                <w:bCs/>
+                <w:color w:val="000000"/>
+              </w:rPr>
+              <w:t xml:space="preserve">Treated: acoustic ceiling or wall panels</w:t>
+            </w:r>
+          </w:p>
+        </w:tc>
+        <w:tc>
+          <w:tcPr>
+            <w:tcW w:type="dxa" w:w="1500"/>
+            <w:tcBorders>
+              <w:top w:val="single" w:color="BFC6CE" w:sz="1"/>
+              <w:left w:val="single" w:color="BFC6CE" w:sz="1"/>
+              <w:bottom w:val="single" w:color="BFC6CE" w:sz="1"/>
+              <w:right w:val="single" w:color="BFC6CE" w:sz="1"/>
+            </w:tcBorders>
+            <w:tcMar>
+              <w:top w:type="dxa" w:w="80"/>
+              <w:left w:type="dxa" w:w="120"/>
+              <w:bottom w:type="dxa" w:w="80"/>
+              <w:right w:type="dxa" w:w="120"/>
+            </w:tcMar>
+          </w:tcPr>
+          <w:p>
+            <w:pPr>
+              <w:keepNext/>
+            </w:pPr>
+            <w:r>
+              <w:rPr>
+                <w:b w:val="false"/>
+                <w:bCs w:val="false"/>
+                <w:color w:val="000000"/>
+              </w:rPr>
+              <w:t xml:space="preserve">0.35</w:t>
+            </w:r>
+          </w:p>
+        </w:tc>
+        <w:tc>
+          <w:tcPr>
+            <w:tcW w:type="dxa" w:w="3500"/>
+            <w:tcBorders>
+              <w:top w:val="single" w:color="BFC6CE" w:sz="1"/>
+              <w:left w:val="single" w:color="BFC6CE" w:sz="1"/>
+              <w:bottom w:val="single" w:color="BFC6CE" w:sz="1"/>
+              <w:right w:val="single" w:color="BFC6CE" w:sz="1"/>
+            </w:tcBorders>
+            <w:tcMar>
+              <w:top w:type="dxa" w:w="80"/>
+              <w:left w:type="dxa" w:w="120"/>
+              <w:bottom w:type="dxa" w:w="80"/>
+              <w:right w:type="dxa" w:w="120"/>
+            </w:tcMar>
+          </w:tcPr>
+          <w:p>
+            <w:pPr>
+              <w:keepNext/>
+            </w:pPr>
+            <w:r>
+              <w:rPr>
+                <w:b w:val="false"/>
+                <w:bCs w:val="false"/>
+                <w:color w:val="000000"/>
+              </w:rPr>
+              <w:t xml:space="preserve">about 1.0 s</w:t>
+            </w:r>
+          </w:p>
+        </w:tc>
+      </w:tr>
+      <w:tr>
+        <w:tc>
+          <w:tcPr>
+            <w:tcW w:type="dxa" w:w="4360"/>
+            <w:tcBorders>
+              <w:top w:val="single" w:color="BFC6CE" w:sz="1"/>
+              <w:left w:val="single" w:color="BFC6CE" w:sz="1"/>
+              <w:bottom w:val="single" w:color="BFC6CE" w:sz="1"/>
+              <w:right w:val="single" w:color="BFC6CE" w:sz="1"/>
+            </w:tcBorders>
+            <w:shd w:fill="EDF1F6" w:val="clear"/>
+            <w:tcMar>
+              <w:top w:type="dxa" w:w="80"/>
+              <w:left w:type="dxa" w:w="120"/>
+              <w:bottom w:type="dxa" w:w="80"/>
+              <w:right w:type="dxa" w:w="120"/>
+            </w:tcMar>
+          </w:tcPr>
+          <w:p>
+            <w:pPr>
+              <w:keepNext/>
+            </w:pPr>
+            <w:r>
+              <w:rPr>
+                <w:b/>
+                <w:bCs/>
+                <w:color w:val="000000"/>
+              </w:rPr>
+              <w:t xml:space="preserve">Highly treated: absorptive ceiling and walls</w:t>
+            </w:r>
+          </w:p>
+        </w:tc>
+        <w:tc>
+          <w:tcPr>
+            <w:tcW w:type="dxa" w:w="1500"/>
+            <w:tcBorders>
+              <w:top w:val="single" w:color="BFC6CE" w:sz="1"/>
+              <w:left w:val="single" w:color="BFC6CE" w:sz="1"/>
+              <w:bottom w:val="single" w:color="BFC6CE" w:sz="1"/>
+              <w:right w:val="single" w:color="BFC6CE" w:sz="1"/>
+            </w:tcBorders>
+            <w:tcMar>
+              <w:top w:type="dxa" w:w="80"/>
+              <w:left w:type="dxa" w:w="120"/>
+              <w:bottom w:type="dxa" w:w="80"/>
+              <w:right w:type="dxa" w:w="120"/>
+            </w:tcMar>
+          </w:tcPr>
+          <w:p>
+            <w:pPr>
+              <w:keepNext/>
+            </w:pPr>
+            <w:r>
+              <w:rPr>
+                <w:b w:val="false"/>
+                <w:bCs w:val="false"/>
+                <w:color w:val="000000"/>
+              </w:rPr>
+              <w:t xml:space="preserve">0.50</w:t>
+            </w:r>
+          </w:p>
+        </w:tc>
+        <w:tc>
+          <w:tcPr>
+            <w:tcW w:type="dxa" w:w="3500"/>
+            <w:tcBorders>
+              <w:top w:val="single" w:color="BFC6CE" w:sz="1"/>
+              <w:left w:val="single" w:color="BFC6CE" w:sz="1"/>
+              <w:bottom w:val="single" w:color="BFC6CE" w:sz="1"/>
+              <w:right w:val="single" w:color="BFC6CE" w:sz="1"/>
+            </w:tcBorders>
+            <w:tcMar>
+              <w:top w:type="dxa" w:w="80"/>
+              <w:left w:type="dxa" w:w="120"/>
+              <w:bottom w:type="dxa" w:w="80"/>
+              <w:right w:type="dxa" w:w="120"/>
+            </w:tcMar>
+          </w:tcPr>
+          <w:p>
+            <w:pPr>
+              <w:keepNext/>
+            </w:pPr>
+            <w:r>
+              <w:rPr>
+                <w:b w:val="false"/>
+                <w:bCs w:val="false"/>
+                <w:color w:val="000000"/>
+              </w:rPr>
+              <w:t xml:space="preserve">about 0.7 s</w:t>
+            </w:r>
+          </w:p>
+        </w:tc>
+      </w:tr>
+    </w:tbl>
+    <w:p>
+      <w:pPr>
+        <w:spacing w:before="160" w:after="0"/>
+      </w:pPr>
+      <w:r>
+        <w:rPr>
+          <w:b/>
+          <w:bCs/>
+        </w:rPr>
+        <w:t xml:space="preserve">Room geometry. </w:t>
+      </w:r>
+      <w:r>
+        <w:t xml:space="preserve">The floor area A comes from the outline; the volume is V = A·h, and the surface area S is 2A plus the wall area around the edge. Each room edge is checked every 0.25 m: where a full-height wall runs along it, it is wall; where it borders another room without a wall, it is an opening. Openings up to 8 m long are doorways as tall as the Doorway height setting (default 3 m); longer ones are open plan, open to the full ceiling height. The openings between rooms i and j, plus the walls on their shared edge weighted by their transmission loss (area × 10^(−TL/10)), make up the coupling area C</w:t>
+      </w:r>
+      <w:r>
+        <w:rPr>
+          <w:i/>
+          <w:iCs/>
+          <w:vertAlign w:val="subscript"/>
+        </w:rPr>
+        <w:t xml:space="preserve">ij</w:t>
+      </w:r>
+      <w:r>
+        <w:t xml:space="preserve">.</w:t>
+      </w:r>
+    </w:p>
+    <w:p>
+      <w:pPr>
+        <w:spacing w:before="120" w:after="0"/>
+      </w:pPr>
+      <w:r>
+        <w:rPr>
+          <w:b/>
+          <w:bCs/>
+        </w:rPr>
+        <w:t xml:space="preserve">Reverberant level. </w:t>
+      </w:r>
+      <w:r>
+        <w:t xml:space="preserve">Each machine’s sound power level follows from its level at the reference distance:</w:t>
+      </w:r>
+    </w:p>
+    <w:p>
+      <w:pPr>
+        <w:spacing w:after="120" w:before="120"/>
+        <w:jc w:val="center"/>
+      </w:pPr>
+      <w:r>
+        <w:rPr>
+          <w:i/>
+          <w:iCs/>
+          <w:sz w:val="24"/>
+          <w:szCs w:val="24"/>
+        </w:rPr>
+        <w:t xml:space="preserve">L</w:t>
+      </w:r>
+      <w:r>
+        <w:rPr>
+          <w:i/>
+          <w:iCs/>
+          <w:vertAlign w:val="subscript"/>
+        </w:rPr>
+        <w:t xml:space="preserve">W</w:t>
+      </w:r>
+      <w:r>
+        <w:rPr>
+          <w:i/>
+          <w:iCs/>
+          <w:sz w:val="24"/>
+          <w:szCs w:val="24"/>
+        </w:rPr>
+        <w:t xml:space="preserve"> = L</w:t>
+      </w:r>
+      <w:r>
+        <w:rPr>
+          <w:i/>
+          <w:iCs/>
+          <w:vertAlign w:val="subscript"/>
+        </w:rPr>
+        <w:t xml:space="preserve">p1</w:t>
+      </w:r>
+      <w:r>
+        <w:rPr>
+          <w:i/>
+          <w:iCs/>
+          <w:sz w:val="24"/>
+          <w:szCs w:val="24"/>
+        </w:rPr>
+        <w:t xml:space="preserve"> + 20 · log</w:t>
+      </w:r>
+      <w:r>
+        <w:rPr>
+          <w:i/>
+          <w:iCs/>
+          <w:vertAlign w:val="subscript"/>
+        </w:rPr>
+        <w:t xml:space="preserve">10</w:t>
+      </w:r>
+      <w:r>
+        <w:rPr>
+          <w:i/>
+          <w:iCs/>
+          <w:sz w:val="24"/>
+          <w:szCs w:val="24"/>
+        </w:rPr>
+        <w:t xml:space="preserve">( r</w:t>
+      </w:r>
+      <w:r>
+        <w:rPr>
+          <w:i/>
+          <w:iCs/>
+          <w:vertAlign w:val="subscript"/>
+        </w:rPr>
+        <w:t xml:space="preserve">1</w:t>
+      </w:r>
+      <w:r>
+        <w:rPr>
+          <w:i/>
+          <w:iCs/>
+          <w:sz w:val="24"/>
+          <w:szCs w:val="24"/>
+        </w:rPr>
+        <w:t xml:space="preserve"> ) + 10 · log</w:t>
+      </w:r>
+      <w:r>
+        <w:rPr>
+          <w:i/>
+          <w:iCs/>
+          <w:vertAlign w:val="subscript"/>
+        </w:rPr>
+        <w:t xml:space="preserve">10</w:t>
+      </w:r>
+      <w:r>
+        <w:rPr>
+          <w:i/>
+          <w:iCs/>
+          <w:sz w:val="24"/>
+          <w:szCs w:val="24"/>
+        </w:rPr>
+        <w:t xml:space="preserve">( 4π )</w:t>
+      </w:r>
+    </w:p>
+    <w:p>
+      <w:r>
+        <w:t xml:space="preserve">For a single room on its own, the reverberant level is the textbook Sabine result:</w:t>
+      </w:r>
+    </w:p>
+    <w:p>
+      <w:pPr>
+        <w:spacing w:after="120" w:before="120"/>
+        <w:jc w:val="center"/>
+      </w:pPr>
+      <w:r>
+        <w:rPr>
+          <w:i/>
+          <w:iCs/>
+          <w:sz w:val="24"/>
+          <w:szCs w:val="24"/>
+        </w:rPr>
+        <w:t xml:space="preserve">L</w:t>
+      </w:r>
+      <w:r>
+        <w:rPr>
+          <w:i/>
+          <w:iCs/>
+          <w:vertAlign w:val="subscript"/>
+        </w:rPr>
+        <w:t xml:space="preserve">rev</w:t>
+      </w:r>
+      <w:r>
+        <w:rPr>
+          <w:i/>
+          <w:iCs/>
+          <w:sz w:val="24"/>
+          <w:szCs w:val="24"/>
+        </w:rPr>
+        <w:t xml:space="preserve"> = L</w:t>
+      </w:r>
+      <w:r>
+        <w:rPr>
+          <w:i/>
+          <w:iCs/>
+          <w:vertAlign w:val="subscript"/>
+        </w:rPr>
+        <w:t xml:space="preserve">W</w:t>
+      </w:r>
+      <w:r>
+        <w:rPr>
+          <w:i/>
+          <w:iCs/>
+          <w:sz w:val="24"/>
+          <w:szCs w:val="24"/>
+        </w:rPr>
+        <w:t xml:space="preserve"> + 10 · log</w:t>
+      </w:r>
+      <w:r>
+        <w:rPr>
+          <w:i/>
+          <w:iCs/>
+          <w:vertAlign w:val="subscript"/>
+        </w:rPr>
+        <w:t xml:space="preserve">10</w:t>
+      </w:r>
+      <w:r>
+        <w:rPr>
+          <w:i/>
+          <w:iCs/>
+          <w:sz w:val="24"/>
+          <w:szCs w:val="24"/>
+        </w:rPr>
+        <w:t xml:space="preserve">( 4 ⁄ R ) ,      R = S α ⁄ (1 − α)</w:t>
+      </w:r>
+    </w:p>
+    <w:p>
+      <w:r>
+        <w:t xml:space="preserve">With several rooms, each room’s reverberant energy e</w:t>
+      </w:r>
+      <w:r>
+        <w:rPr>
+          <w:i/>
+          <w:iCs/>
+          <w:vertAlign w:val="subscript"/>
+        </w:rPr>
+        <w:t xml:space="preserve">i</w:t>
+      </w:r>
+      <w:r>
+        <w:t xml:space="preserve"> (where e = 10^(L/10)) also exchanges sound with its neighbors through C</w:t>
+      </w:r>
+      <w:r>
+        <w:rPr>
+          <w:i/>
+          <w:iCs/>
+          <w:vertAlign w:val="subscript"/>
+        </w:rPr>
+        <w:t xml:space="preserve">ij</w:t>
+      </w:r>
+      <w:r>
+        <w:t xml:space="preserve">. The tool solves the energy balance of all rooms together:</w:t>
+      </w:r>
+    </w:p>
+    <w:p>
+      <w:pPr>
+        <w:spacing w:after="120" w:before="120"/>
+        <w:jc w:val="center"/>
+      </w:pPr>
+      <w:r>
+        <w:rPr>
+          <w:i/>
+          <w:iCs/>
+          <w:sz w:val="24"/>
+          <w:szCs w:val="24"/>
+        </w:rPr>
+        <w:t xml:space="preserve">e</w:t>
+      </w:r>
+      <w:r>
+        <w:rPr>
+          <w:i/>
+          <w:iCs/>
+          <w:vertAlign w:val="subscript"/>
+        </w:rPr>
+        <w:t xml:space="preserve">i</w:t>
+      </w:r>
+      <w:r>
+        <w:rPr>
+          <w:i/>
+          <w:iCs/>
+          <w:sz w:val="24"/>
+          <w:szCs w:val="24"/>
+        </w:rPr>
+        <w:t xml:space="preserve"> · ( A</w:t>
+      </w:r>
+      <w:r>
+        <w:rPr>
+          <w:i/>
+          <w:iCs/>
+          <w:vertAlign w:val="subscript"/>
+        </w:rPr>
+        <w:t xml:space="preserve">i</w:t>
+      </w:r>
+      <w:r>
+        <w:rPr>
+          <w:i/>
+          <w:iCs/>
+          <w:sz w:val="24"/>
+          <w:szCs w:val="24"/>
+        </w:rPr>
+        <w:t xml:space="preserve"> + Σ C</w:t>
+      </w:r>
+      <w:r>
+        <w:rPr>
+          <w:i/>
+          <w:iCs/>
+          <w:vertAlign w:val="subscript"/>
+        </w:rPr>
+        <w:t xml:space="preserve">ij</w:t>
+      </w:r>
+      <w:r>
+        <w:rPr>
+          <w:i/>
+          <w:iCs/>
+          <w:sz w:val="24"/>
+          <w:szCs w:val="24"/>
+        </w:rPr>
+        <w:t xml:space="preserve"> ) − Σ C</w:t>
+      </w:r>
+      <w:r>
+        <w:rPr>
+          <w:i/>
+          <w:iCs/>
+          <w:vertAlign w:val="subscript"/>
+        </w:rPr>
+        <w:t xml:space="preserve">ij</w:t>
+      </w:r>
+      <w:r>
+        <w:rPr>
+          <w:i/>
+          <w:iCs/>
+          <w:sz w:val="24"/>
+          <w:szCs w:val="24"/>
+        </w:rPr>
+        <w:t xml:space="preserve"> · e</w:t>
+      </w:r>
+      <w:r>
+        <w:rPr>
+          <w:i/>
+          <w:iCs/>
+          <w:vertAlign w:val="subscript"/>
+        </w:rPr>
+        <w:t xml:space="preserve">j</w:t>
+      </w:r>
+      <w:r>
+        <w:rPr>
+          <w:i/>
+          <w:iCs/>
+          <w:sz w:val="24"/>
+          <w:szCs w:val="24"/>
+        </w:rPr>
+        <w:t xml:space="preserve"> = (1 − α</w:t>
+      </w:r>
+      <w:r>
+        <w:rPr>
+          <w:i/>
+          <w:iCs/>
+          <w:vertAlign w:val="subscript"/>
+        </w:rPr>
+        <w:t xml:space="preserve">i</w:t>
+      </w:r>
+      <w:r>
+        <w:rPr>
+          <w:i/>
+          <w:iCs/>
+          <w:sz w:val="24"/>
+          <w:szCs w:val="24"/>
+        </w:rPr>
+        <w:t xml:space="preserve">) · ( 4 W</w:t>
+      </w:r>
+      <w:r>
+        <w:rPr>
+          <w:i/>
+          <w:iCs/>
+          <w:vertAlign w:val="subscript"/>
+        </w:rPr>
+        <w:t xml:space="preserve">i</w:t>
+      </w:r>
+      <w:r>
+        <w:rPr>
+          <w:i/>
+          <w:iCs/>
+          <w:sz w:val="24"/>
+          <w:szCs w:val="24"/>
+        </w:rPr>
+        <w:t xml:space="preserve"> + S</w:t>
+      </w:r>
+      <w:r>
+        <w:rPr>
+          <w:i/>
+          <w:iCs/>
+          <w:vertAlign w:val="subscript"/>
+        </w:rPr>
+        <w:t xml:space="preserve">i</w:t>
+      </w:r>
+      <w:r>
+        <w:rPr>
+          <w:i/>
+          <w:iCs/>
+          <w:sz w:val="24"/>
+          <w:szCs w:val="24"/>
+        </w:rPr>
+        <w:t xml:space="preserve"> · E</w:t>
+      </w:r>
+      <w:r>
+        <w:rPr>
+          <w:i/>
+          <w:iCs/>
+          <w:vertAlign w:val="subscript"/>
+        </w:rPr>
+        <w:t xml:space="preserve">d,i</w:t>
+      </w:r>
+      <w:r>
+        <w:rPr>
+          <w:i/>
+          <w:iCs/>
+          <w:sz w:val="24"/>
+          <w:szCs w:val="24"/>
+        </w:rPr>
+        <w:t xml:space="preserve"> )</w:t>
+      </w:r>
+    </w:p>
+    <w:p>
+      <w:r>
+        <w:t xml:space="preserve">Here A</w:t>
+      </w:r>
+      <w:r>
+        <w:rPr>
+          <w:i/>
+          <w:iCs/>
+          <w:vertAlign w:val="subscript"/>
+        </w:rPr>
+        <w:t xml:space="preserve">i</w:t>
+      </w:r>
+      <w:r>
+        <w:t xml:space="preserve"> = α</w:t>
+      </w:r>
+      <w:r>
+        <w:rPr>
+          <w:i/>
+          <w:iCs/>
+          <w:vertAlign w:val="subscript"/>
+        </w:rPr>
+        <w:t xml:space="preserve">i</w:t>
+      </w:r>
+      <w:r>
+        <w:t xml:space="preserve"> S</w:t>
+      </w:r>
+      <w:r>
+        <w:rPr>
+          <w:i/>
+          <w:iCs/>
+          <w:vertAlign w:val="subscript"/>
+        </w:rPr>
+        <w:t xml:space="preserve">i</w:t>
+      </w:r>
+      <w:r>
+        <w:t xml:space="preserve">; W</w:t>
+      </w:r>
+      <w:r>
+        <w:rPr>
+          <w:i/>
+          <w:iCs/>
+          <w:vertAlign w:val="subscript"/>
+        </w:rPr>
+        <w:t xml:space="preserve">i</w:t>
+      </w:r>
+      <w:r>
+        <w:t xml:space="preserve"> is the sound power of the machines inside room i; and E</w:t>
+      </w:r>
+      <w:r>
+        <w:rPr>
+          <w:i/>
+          <w:iCs/>
+          <w:vertAlign w:val="subscript"/>
+        </w:rPr>
+        <w:t xml:space="preserve">d,i</w:t>
+      </w:r>
+      <w:r>
+        <w:t xml:space="preserve"> is the room-average direct sound reaching room i from machines in other rooms (through doorways and walls, as in Section 4.4). For one room on its own this reduces exactly to the formula above. The reverberation time shown for each room is Sabine’s, and typing a measured value sets α from it:</w:t>
+      </w:r>
+    </w:p>
+    <w:p>
+      <w:pPr>
+        <w:spacing w:after="120" w:before="120"/>
+        <w:jc w:val="center"/>
+      </w:pPr>
+      <w:r>
+        <w:rPr>
+          <w:i/>
+          <w:iCs/>
+          <w:sz w:val="24"/>
+          <w:szCs w:val="24"/>
+        </w:rPr>
+        <w:t xml:space="preserve">T</w:t>
+      </w:r>
+      <w:r>
+        <w:rPr>
+          <w:i/>
+          <w:iCs/>
+          <w:vertAlign w:val="subscript"/>
+        </w:rPr>
+        <w:t xml:space="preserve">60</w:t>
+      </w:r>
+      <w:r>
+        <w:rPr>
+          <w:i/>
+          <w:iCs/>
+          <w:sz w:val="24"/>
+          <w:szCs w:val="24"/>
+        </w:rPr>
+        <w:t xml:space="preserve"> = 0.161 · V ⁄ ( α S + Σ C</w:t>
+      </w:r>
+      <w:r>
+        <w:rPr>
+          <w:i/>
+          <w:iCs/>
+          <w:vertAlign w:val="subscript"/>
+        </w:rPr>
+        <w:t xml:space="preserve">ij</w:t>
+      </w:r>
+      <w:r>
+        <w:rPr>
+          <w:i/>
+          <w:iCs/>
+          <w:sz w:val="24"/>
+          <w:szCs w:val="24"/>
+        </w:rPr>
+        <w:t xml:space="preserve"> )</w:t>
+      </w:r>
+    </w:p>
+    <w:p>
+      <w:pPr>
+        <w:spacing w:before="120" w:after="0"/>
+      </w:pPr>
+      <w:r>
+        <w:rPr>
+          <w:b/>
+          <w:bCs/>
+        </w:rPr>
+        <w:t xml:space="preserve">Final level. </w:t>
+      </w:r>
+      <w:r>
+        <w:t xml:space="preserve">At each location, the reverberant energy of the room it is in is added to the direct, around-the-wall and reflected sound of Section 4.4 by energy addition. The residual correction (Step 3 of Section 4.3) is then applied room by room: a room with SLM readings is corrected only by its own readings, and a room without readings borrows its neighbors’ corrections.</w:t>
+      </w:r>
+    </w:p>
+    <w:p>
+      <w:pPr>
+        <w:pStyle w:val="Heading2"/>
+      </w:pPr>
+      <w:r>
+        <w:t xml:space="preserve">4.6 Assumptions and limitations</w:t>
       </w:r>
     </w:p>
     <w:p>
@@ -3152,7 +4296,7 @@
         </w:numPr>
       </w:pPr>
       <w:r>
-        <w:t xml:space="preserve">Walls are modeled in 2-D with single-number (dBA) values: one reflection per wall, no reflections from the floor or ceiling, and no reverberant build-up of sound in the room. Real walls and barriers block high-pitched noise better than low rumble. Through doorways the model can show line-of-sight “beams” that reverberation would partly fill in. Residual correction compensates, mainly near the measurements.</w:t>
+        <w:t xml:space="preserve">Walls are modeled in 2-D with single-number (dBA) values: one reflection per wall and no reflections from the floor or ceiling. Real walls and barriers block high-pitched noise better than low rumble. Reverberation is included only in rooms that are drawn, as an evenly spread (diffuse) field; in long, low halls the reverberant level in fact falls slowly with distance, so far from machines the map may read slightly high. Without rooms, the model can show line-of-sight “beams” through doorways that reverberation would fill in. Residual correction compensates, mainly near the measurements.</w:t>
       </w:r>
     </w:p>
     <w:p>
@@ -3182,10 +4326,10 @@
     <w:p>
       <w:pPr>
         <w:pStyle w:val="Heading2"/>
-        <w:pageBreakBefore/>
-      </w:pPr>
-      <w:r>
-        <w:t xml:space="preserve">4.6 Choosing a method</w:t>
+        <w:keepNext/>
+      </w:pPr>
+      <w:r>
+        <w:t xml:space="preserve">4.7 Choosing a method</w:t>
       </w:r>
     </w:p>
     <w:tbl>
@@ -3538,7 +4682,7 @@
                 <w:bCs w:val="false"/>
                 <w:color w:val="000000"/>
               </w:rPr>
-              <w:t xml:space="preserve">Needs a calibrated scale and reliable source levels; first-order wall model with no reverberation</w:t>
+              <w:t xml:space="preserve">Needs a calibrated scale and reliable source levels; first-order wall model; reverberation only in drawn rooms</w:t>
             </w:r>
           </w:p>
         </w:tc>
@@ -4079,6 +5223,177 @@
                 <w:color w:val="000000"/>
               </w:rPr>
               <w:t xml:space="preserve">Check the wall settings in sidebar section 3. Blocking and reflections apply to the source model only; IDW and RBF use walls to stop readings passing through them.</w:t>
+            </w:r>
+          </w:p>
+        </w:tc>
+      </w:tr>
+      <w:tr>
+        <w:tc>
+          <w:tcPr>
+            <w:tcW w:type="dxa" w:w="3500"/>
+            <w:tcBorders>
+              <w:top w:val="single" w:color="BFC6CE" w:sz="1"/>
+              <w:left w:val="single" w:color="BFC6CE" w:sz="1"/>
+              <w:bottom w:val="single" w:color="BFC6CE" w:sz="1"/>
+              <w:right w:val="single" w:color="BFC6CE" w:sz="1"/>
+            </w:tcBorders>
+            <w:shd w:fill="EDF1F6" w:val="clear"/>
+            <w:tcMar>
+              <w:top w:type="dxa" w:w="80"/>
+              <w:left w:type="dxa" w:w="120"/>
+              <w:bottom w:type="dxa" w:w="80"/>
+              <w:right w:type="dxa" w:w="120"/>
+            </w:tcMar>
+          </w:tcPr>
+          <w:p>
+            <w:r>
+              <w:rPr>
+                <w:b/>
+                <w:bCs/>
+                <w:color w:val="000000"/>
+              </w:rPr>
+              <w:t xml:space="preserve">A whole room is about the same color</w:t>
+            </w:r>
+          </w:p>
+        </w:tc>
+        <w:tc>
+          <w:tcPr>
+            <w:tcW w:type="dxa" w:w="5860"/>
+            <w:tcBorders>
+              <w:top w:val="single" w:color="BFC6CE" w:sz="1"/>
+              <w:left w:val="single" w:color="BFC6CE" w:sz="1"/>
+              <w:bottom w:val="single" w:color="BFC6CE" w:sz="1"/>
+              <w:right w:val="single" w:color="BFC6CE" w:sz="1"/>
+            </w:tcBorders>
+            <w:tcMar>
+              <w:top w:type="dxa" w:w="80"/>
+              <w:left w:type="dxa" w:w="120"/>
+              <w:bottom w:type="dxa" w:w="80"/>
+              <w:right w:type="dxa" w:w="120"/>
+            </w:tcMar>
+          </w:tcPr>
+          <w:p>
+            <w:r>
+              <w:rPr>
+                <w:b w:val="false"/>
+                <w:bCs w:val="false"/>
+                <w:color w:val="000000"/>
+              </w:rPr>
+              <w:t xml:space="preserve">That is reverberation evening out the room, as in real hard rooms. If it looks too loud or too quiet, check the room’s finish and ceiling height, or type in a measured reverberation time. Readings in the room also correct it.</w:t>
+            </w:r>
+          </w:p>
+        </w:tc>
+      </w:tr>
+      <w:tr>
+        <w:tc>
+          <w:tcPr>
+            <w:tcW w:type="dxa" w:w="3500"/>
+            <w:tcBorders>
+              <w:top w:val="single" w:color="BFC6CE" w:sz="1"/>
+              <w:left w:val="single" w:color="BFC6CE" w:sz="1"/>
+              <w:bottom w:val="single" w:color="BFC6CE" w:sz="1"/>
+              <w:right w:val="single" w:color="BFC6CE" w:sz="1"/>
+            </w:tcBorders>
+            <w:shd w:fill="EDF1F6" w:val="clear"/>
+            <w:tcMar>
+              <w:top w:type="dxa" w:w="80"/>
+              <w:left w:type="dxa" w:w="120"/>
+              <w:bottom w:type="dxa" w:w="80"/>
+              <w:right w:type="dxa" w:w="120"/>
+            </w:tcMar>
+          </w:tcPr>
+          <w:p>
+            <w:r>
+              <w:rPr>
+                <w:b/>
+                <w:bCs/>
+                <w:color w:val="000000"/>
+              </w:rPr>
+              <w:t xml:space="preserve">Rooms make no difference</w:t>
+            </w:r>
+          </w:p>
+        </w:tc>
+        <w:tc>
+          <w:tcPr>
+            <w:tcW w:type="dxa" w:w="5860"/>
+            <w:tcBorders>
+              <w:top w:val="single" w:color="BFC6CE" w:sz="1"/>
+              <w:left w:val="single" w:color="BFC6CE" w:sz="1"/>
+              <w:bottom w:val="single" w:color="BFC6CE" w:sz="1"/>
+              <w:right w:val="single" w:color="BFC6CE" w:sz="1"/>
+            </w:tcBorders>
+            <w:tcMar>
+              <w:top w:type="dxa" w:w="80"/>
+              <w:left w:type="dxa" w:w="120"/>
+              <w:bottom w:type="dxa" w:w="80"/>
+              <w:right w:type="dxa" w:w="120"/>
+            </w:tcMar>
+          </w:tcPr>
+          <w:p>
+            <w:r>
+              <w:rPr>
+                <w:b w:val="false"/>
+                <w:bCs w:val="false"/>
+                <w:color w:val="000000"/>
+              </w:rPr>
+              <w:t xml:space="preserve">Rooms affect only the source model, with Room reverberation ticked (sidebar section 3) and the scale set.</w:t>
+            </w:r>
+          </w:p>
+        </w:tc>
+      </w:tr>
+      <w:tr>
+        <w:tc>
+          <w:tcPr>
+            <w:tcW w:type="dxa" w:w="3500"/>
+            <w:tcBorders>
+              <w:top w:val="single" w:color="BFC6CE" w:sz="1"/>
+              <w:left w:val="single" w:color="BFC6CE" w:sz="1"/>
+              <w:bottom w:val="single" w:color="BFC6CE" w:sz="1"/>
+              <w:right w:val="single" w:color="BFC6CE" w:sz="1"/>
+            </w:tcBorders>
+            <w:shd w:fill="EDF1F6" w:val="clear"/>
+            <w:tcMar>
+              <w:top w:type="dxa" w:w="80"/>
+              <w:left w:type="dxa" w:w="120"/>
+              <w:bottom w:type="dxa" w:w="80"/>
+              <w:right w:type="dxa" w:w="120"/>
+            </w:tcMar>
+          </w:tcPr>
+          <w:p>
+            <w:r>
+              <w:rPr>
+                <w:b/>
+                <w:bCs/>
+                <w:color w:val="000000"/>
+              </w:rPr>
+              <w:t xml:space="preserve">A doorway between two rooms has no effect</w:t>
+            </w:r>
+          </w:p>
+        </w:tc>
+        <w:tc>
+          <w:tcPr>
+            <w:tcW w:type="dxa" w:w="5860"/>
+            <w:tcBorders>
+              <w:top w:val="single" w:color="BFC6CE" w:sz="1"/>
+              <w:left w:val="single" w:color="BFC6CE" w:sz="1"/>
+              <w:bottom w:val="single" w:color="BFC6CE" w:sz="1"/>
+              <w:right w:val="single" w:color="BFC6CE" w:sz="1"/>
+            </w:tcBorders>
+            <w:tcMar>
+              <w:top w:type="dxa" w:w="80"/>
+              <w:left w:type="dxa" w:w="120"/>
+              <w:bottom w:type="dxa" w:w="80"/>
+              <w:right w:type="dxa" w:w="120"/>
+            </w:tcMar>
+          </w:tcPr>
+          <w:p>
+            <w:r>
+              <w:rPr>
+                <w:b w:val="false"/>
+                <w:bCs w:val="false"/>
+                <w:color w:val="000000"/>
+              </w:rPr>
+              <w:t xml:space="preserve">The two rooms must share an edge across the doorway. Drag the rooms’ corners until they snap together.</w:t>
             </w:r>
           </w:p>
         </w:tc>

</xml_diff>